<commit_message>
Checkpoint 1 Oct 2026 night: Tower pass 4 and notation sweep (all four volumes), EE6/EE9 stub rewrites
</commit_message>
<xml_diff>
--- a/EE - Series/EE6/Transceivers_and_High_Power_RF_Book6.docx
+++ b/EE - Series/EE6/Transceivers_and_High_Power_RF_Book6.docx
@@ -89,7 +89,7 @@
         <w:rPr>
           <w:i w:val="0"/>
         </w:rPr>
-        <w:t>This book owns the watts. It follows a transmitter from the device to the antenna: the device families, the load line, the amplifier classes, efficiency under modulated signals and the Doherty amplifier, and then the heat sink, combiners, filters, and feed line that stand between the transistor and the radiated power. It then turns to the receiving half of the radio, its noise figure and dynamic range, and to the oscillator and phase-locked loop that tune both halves. The last chapter, radar, brings transmitter and receiver together.</w:t>
+        <w:t>This book owns the watts. It follows a transmitter from the device to the antenna: the device families, the load line, the amplifier classes, efficiency under modulated signals and the Doherty amplifier, and then the heat sink, combiners, filters, and feed line that stand between the transistor and the radiated power. It then turns to the receiving half of the radio, its noise figure and dynamic range, and to the oscillator and phase-locked loop that tune both halves. Chapter 8, radar, brings transmitter and receiver together. Chapters 9 to 17 deepen the chain: the low-noise amplifier, mixers and frequency planning, the link budget, bias and ruggedness, vacuum tubes, RF exposure, transceiver isolation, the design of class E and F stages, and envelope tracking, polar, and outphasing transmitters.</w:t>
       </w:r>
     </w:p>
     <w:p>
@@ -199,6 +199,87 @@
         <w:rPr>
           <w:i w:val="0"/>
         </w:rPr>
+        <w:t>Chapter 9. The Low-Noise Amplifier</w:t>
+      </w:r>
+    </w:p>
+    <w:p>
+      <w:pPr/>
+      <w:r>
+        <w:rPr>
+          <w:i w:val="0"/>
+        </w:rPr>
+        <w:t>Chapter 10. Mixers and Frequency Planning</w:t>
+      </w:r>
+    </w:p>
+    <w:p>
+      <w:pPr/>
+      <w:r>
+        <w:rPr>
+          <w:i w:val="0"/>
+        </w:rPr>
+        <w:t>Chapter 11. The Link Budget</w:t>
+      </w:r>
+    </w:p>
+    <w:p>
+      <w:pPr/>
+      <w:r>
+        <w:rPr>
+          <w:i w:val="0"/>
+        </w:rPr>
+        <w:t>Chapter 12. Bias, Ruggedness, and Protection</w:t>
+      </w:r>
+    </w:p>
+    <w:p>
+      <w:pPr/>
+      <w:r>
+        <w:rPr>
+          <w:i w:val="0"/>
+        </w:rPr>
+        <w:t>Chapter 13. Vacuum Tubes: Klystrons, TWTs, and Magnetrons</w:t>
+      </w:r>
+    </w:p>
+    <w:p>
+      <w:pPr/>
+      <w:r>
+        <w:rPr>
+          <w:i w:val="0"/>
+        </w:rPr>
+        <w:t>Chapter 14. RF Exposure and Safety</w:t>
+      </w:r>
+    </w:p>
+    <w:p>
+      <w:pPr/>
+      <w:r>
+        <w:rPr>
+          <w:i w:val="0"/>
+        </w:rPr>
+        <w:t>Chapter 15. Transceiver Architectures and Isolation</w:t>
+      </w:r>
+    </w:p>
+    <w:p>
+      <w:pPr/>
+      <w:r>
+        <w:rPr>
+          <w:i w:val="0"/>
+        </w:rPr>
+        <w:t>Chapter 16. Designing Class E and Class F Amplifiers</w:t>
+      </w:r>
+    </w:p>
+    <w:p>
+      <w:pPr/>
+      <w:r>
+        <w:rPr>
+          <w:i w:val="0"/>
+        </w:rPr>
+        <w:t>Chapter 17. Envelope Tracking, Polar, and Outphasing</w:t>
+      </w:r>
+    </w:p>
+    <w:p>
+      <w:pPr/>
+      <w:r>
+        <w:rPr>
+          <w:i w:val="0"/>
+        </w:rPr>
         <w:t>Appendix A. Constants and Formulas Used in This Book</w:t>
       </w:r>
     </w:p>
@@ -2921,6 +3002,3130 @@
         <w:rPr>
           <w:i w:val="0"/>
         </w:rPr>
+        <w:t>Chapter 9. The Low-Noise Amplifier</w:t>
+      </w:r>
+    </w:p>
+    <w:p>
+      <w:pPr/>
+      <w:r>
+        <w:rPr>
+          <w:i w:val="0"/>
+        </w:rPr>
+        <w:t>Chapter 6 showed that the first stage of a receiver sets its noise figure. This chapter designs that stage. A low-noise amplifier must add as little noise as possible, provide enough gain to hide the stages after it, remain stable, survive the strong signals and transmitter leakage around it, and match the antenna well enough not to reflect the signal away. Those goals conflict, because the source impedance that minimizes a transistor's noise is not the one that maximizes its gain or its input match. The LNA designer's craft is resolving that conflict. Stability from S-parameters, which every amplifier must satisfy, is treated in Book 4; this chapter assumes a stable device.</w:t>
+      </w:r>
+    </w:p>
+    <w:p>
+      <w:pPr>
+        <w:pStyle w:val="Heading2"/>
+      </w:pPr>
+      <w:r>
+        <w:rPr>
+          <w:i w:val="0"/>
+        </w:rPr>
+        <w:t>9.1 The noise parameters</w:t>
+      </w:r>
+    </w:p>
+    <w:p>
+      <w:pPr/>
+      <w:r>
+        <w:rPr>
+          <w:i w:val="0"/>
+        </w:rPr>
+        <w:t>A transistor's noise figure depends on the impedance of the source driving it, which the input matching network sets. Four noise parameters describe the dependence: the minimum noise factor Fmin, the optimum source reflection coefficient Γopt at which it occurs, and the noise resistance Rn, which says how fast the noise rises as the source moves away from Γopt. A device with small Rn is forgiving; one with large Rn must be matched precisely. Manufacturers give the four parameters at each frequency, and they are measured with a tuner that sweeps the source impedance.</w:t>
+      </w:r>
+    </w:p>
+    <w:p>
+      <w:pPr>
+        <w:jc w:val="center"/>
+      </w:pPr>
+      <w:r>
+        <w:rPr>
+          <w:i w:val="0"/>
+        </w:rPr>
+        <w:t>F = Fmin + (4Rn/Z0) |Γs − Γopt|² / [(1 − |Γs|²) |1 + Γopt|²]</w:t>
+      </w:r>
+    </w:p>
+    <w:p>
+      <w:pPr>
+        <w:pStyle w:val="Heading2"/>
+      </w:pPr>
+      <w:r>
+        <w:rPr>
+          <w:i w:val="0"/>
+        </w:rPr>
+        <w:t>Worked Example 9.1</w:t>
+      </w:r>
+    </w:p>
+    <w:p>
+      <w:pPr/>
+      <w:r>
+        <w:rPr>
+          <w:b/>
+        </w:rPr>
+        <w:t xml:space="preserve">Problem. </w:t>
+      </w:r>
+      <w:r>
+        <w:rPr>
+          <w:i w:val="0"/>
+        </w:rPr>
+        <w:t>A transistor has NFmin = 0.5 dB, Rn = 8 Ω, and Γopt = 0.5∠60° in a 50 Ω system. Find its noise figure with a 50 Ω source, Γs = 0, and with Γs = 0.3∠60° and 0.5∠30°.</w:t>
+      </w:r>
+    </w:p>
+    <w:p>
+      <w:pPr/>
+      <w:r>
+        <w:rPr>
+          <w:b/>
+        </w:rPr>
+        <w:t xml:space="preserve">Solution. </w:t>
+      </w:r>
+      <w:r>
+        <w:rPr>
+          <w:i w:val="0"/>
+        </w:rPr>
+        <w:t>With Γs = 0, F = 1.122 + (32/50) × 0.25/(1 × |1 + 0.5∠60°|²) = 1.122 + 0.64 × 0.25/1.75 = 1.213, or 0.84 dB. At Γs = Γopt the figure is the minimum, 0.50 dB. With Γs = 0.3∠60°, a partial step toward the optimum, it is 0.56 dB, and with 0.5∠30°, the right magnitude at the wrong angle, 0.62 dB. Driving the device straight from 50 Ω would cost 0.34 dB, which in a satellite ground receiver, where the antenna's noise temperature is only tens of kelvin, is a large fraction of the system noise.</w:t>
+      </w:r>
+    </w:p>
+    <w:p>
+      <w:pPr>
+        <w:pStyle w:val="Heading2"/>
+      </w:pPr>
+      <w:r>
+        <w:rPr>
+          <w:i w:val="0"/>
+        </w:rPr>
+        <w:t>9.2 Noise match versus gain match</w:t>
+      </w:r>
+    </w:p>
+    <w:p>
+      <w:pPr/>
+      <w:r>
+        <w:rPr>
+          <w:i w:val="0"/>
+        </w:rPr>
+        <w:t>The source impedance for minimum noise is generally not the conjugate of the device's input impedance, so a noise-matched LNA reflects part of the incoming power and has a poor input return loss. Two techniques reconcile them. Inductive source degeneration, a small inductance in the emitter or source, adds a real part to the input impedance without adding noise, moving the input match toward Γopt's conjugate; it is the standard narrowband CMOS and HEMT LNA. Balanced amplifiers place two identical noise-matched stages between 90° hybrids, so that their reflections cancel at the input port and appear instead in the hybrid's load, giving both low noise and good match at the cost of twice the devices.</w:t>
+      </w:r>
+    </w:p>
+    <w:p>
+      <w:pPr/>
+      <w:r>
+        <w:rPr>
+          <w:b/>
+        </w:rPr>
+        <w:t xml:space="preserve">Key idea. </w:t>
+      </w:r>
+      <w:r>
+        <w:rPr>
+          <w:i w:val="0"/>
+        </w:rPr>
+        <w:t>A transistor has one source impedance for lowest noise and another for best match. The LNA's input network chooses between them, and degeneration or a balanced pair lets it have both.</w:t>
+      </w:r>
+    </w:p>
+    <w:p>
+      <w:pPr>
+        <w:pStyle w:val="Heading2"/>
+      </w:pPr>
+      <w:r>
+        <w:rPr>
+          <w:i w:val="0"/>
+        </w:rPr>
+        <w:t>9.3 Gain and the cascade</w:t>
+      </w:r>
+    </w:p>
+    <w:p>
+      <w:pPr/>
+      <w:r>
+        <w:rPr>
+          <w:i w:val="0"/>
+        </w:rPr>
+        <w:t>The LNA's gain should be high enough that later stages hardly affect the system noise figure, but not so high that it overloads them or lowers the cascade's intercept point, as Chapter 6 showed. A lower-noise device with less gain may give a worse system than a noisier device with more gain. Any loss before the LNA, in a connector, a filter, or a switch, adds decibel for decibel to the noise figure, so in the most sensitive systems the LNA is mounted directly at the antenna, and sometimes cooled.</w:t>
+      </w:r>
+    </w:p>
+    <w:p>
+      <w:pPr>
+        <w:pStyle w:val="Heading2"/>
+      </w:pPr>
+      <w:r>
+        <w:rPr>
+          <w:i w:val="0"/>
+        </w:rPr>
+        <w:t>Worked Example 9.2</w:t>
+      </w:r>
+    </w:p>
+    <w:p>
+      <w:pPr/>
+      <w:r>
+        <w:rPr>
+          <w:b/>
+        </w:rPr>
+        <w:t xml:space="preserve">Problem. </w:t>
+      </w:r>
+      <w:r>
+        <w:rPr>
+          <w:i w:val="0"/>
+        </w:rPr>
+        <w:t>An LNA is followed by a stage with a 6 dB noise figure. Compare device A, with 0.8 dB noise figure and 10 dB gain, and device B, with 0.6 dB and 6 dB gain. Then find the system noise figure if a 0.3 dB loss precedes device A.</w:t>
+      </w:r>
+    </w:p>
+    <w:p>
+      <w:pPr/>
+      <w:r>
+        <w:rPr>
+          <w:b/>
+        </w:rPr>
+        <w:t xml:space="preserve">Solution. </w:t>
+      </w:r>
+      <w:r>
+        <w:rPr>
+          <w:i w:val="0"/>
+        </w:rPr>
+        <w:t>For A, F = 1.202 + (3.981 − 1)/10 = 1.500, a system noise figure of 1.76 dB. For B, F = 1.148 + 2.981/3.981 = 1.897, or 2.78 dB. The lower-noise device gives the worse receiver by a full decibel. With 0.3 dB of loss before device A, the system figure becomes 2.06 dB, and the loss has cost as much as the whole difference between the two devices' own noise figures.</w:t>
+      </w:r>
+    </w:p>
+    <w:p>
+      <w:pPr>
+        <w:pStyle w:val="Heading2"/>
+      </w:pPr>
+      <w:r>
+        <w:rPr>
+          <w:i w:val="0"/>
+        </w:rPr>
+        <w:t>9.4 Linearity and protection</w:t>
+      </w:r>
+    </w:p>
+    <w:p>
+      <w:pPr/>
+      <w:r>
+        <w:rPr>
+          <w:i w:val="0"/>
+        </w:rPr>
+        <w:t>An LNA in a phone or base station sits beside its own transmitter, and in a radar beside a kilowatt pulse. It must tolerate out-of-band blockers without compressing, survive the leakage that the duplexer or switch lets through, Chapter 15's subject, and recover quickly after an overload. Limiters, diodes that clip large signals before the LNA, protect radar receivers, but they add loss and therefore noise. GaN LNAs, which tolerate several watts of input, are increasingly used where survivability matters more than the last tenth of a decibel.</w:t>
+      </w:r>
+    </w:p>
+    <w:p>
+      <w:pPr>
+        <w:pStyle w:val="Heading2"/>
+      </w:pPr>
+      <w:r>
+        <w:rPr>
+          <w:i w:val="0"/>
+        </w:rPr>
+        <w:t>Practice</w:t>
+      </w:r>
+    </w:p>
+    <w:p>
+      <w:pPr/>
+      <w:r>
+        <w:rPr>
+          <w:b/>
+        </w:rPr>
+        <w:t xml:space="preserve">1. </w:t>
+      </w:r>
+      <w:r>
+        <w:rPr>
+          <w:i w:val="0"/>
+        </w:rPr>
+        <w:t>Find the noise factor of a device with NFmin = 1.0 dB, Rn = 10 Ω, and Γopt = 0.4∠90°, with a 50 Ω source.</w:t>
+      </w:r>
+    </w:p>
+    <w:p>
+      <w:pPr/>
+      <w:r>
+        <w:rPr>
+          <w:b/>
+        </w:rPr>
+        <w:t xml:space="preserve">2. </w:t>
+      </w:r>
+      <w:r>
+        <w:rPr>
+          <w:i w:val="0"/>
+        </w:rPr>
+        <w:t>A system has 0.5 dB of cable loss before an LNA with 1.0 dB noise figure and 20 dB gain, followed by a 10 dB stage. Find the system noise figure.</w:t>
+      </w:r>
+    </w:p>
+    <w:p>
+      <w:pPr/>
+      <w:r>
+        <w:rPr>
+          <w:b/>
+        </w:rPr>
+        <w:t xml:space="preserve">3. </w:t>
+      </w:r>
+      <w:r>
+        <w:rPr>
+          <w:i w:val="0"/>
+        </w:rPr>
+        <w:t>What does inductive source degeneration add to an LNA's input impedance?</w:t>
+      </w:r>
+    </w:p>
+    <w:p>
+      <w:pPr/>
+      <w:r>
+        <w:rPr>
+          <w:b/>
+        </w:rPr>
+        <w:t xml:space="preserve">4. </w:t>
+      </w:r>
+      <w:r>
+        <w:rPr>
+          <w:i w:val="0"/>
+        </w:rPr>
+        <w:t>An LNA has 15 dB gain and the next stage a 12 dB noise figure. How much does the second stage add to the noise factor?</w:t>
+      </w:r>
+    </w:p>
+    <w:p>
+      <w:pPr/>
+      <w:r>
+        <w:rPr>
+          <w:b/>
+        </w:rPr>
+        <w:t xml:space="preserve">5. </w:t>
+      </w:r>
+      <w:r>
+        <w:rPr>
+          <w:i w:val="0"/>
+        </w:rPr>
+        <w:t>Why might a lower-noise transistor give a worse receiver?</w:t>
+      </w:r>
+    </w:p>
+    <w:p>
+      <w:pPr/>
+      <w:r>
+        <w:rPr>
+          <w:b/>
+        </w:rPr>
+        <w:t xml:space="preserve">6. </w:t>
+      </w:r>
+      <w:r>
+        <w:rPr>
+          <w:i w:val="0"/>
+        </w:rPr>
+        <w:t>Why does a balanced LNA have a good input match even when each half is noise-matched?</w:t>
+      </w:r>
+    </w:p>
+    <w:p>
+      <w:pPr>
+        <w:pStyle w:val="Heading1"/>
+      </w:pPr>
+      <w:r>
+        <w:rPr>
+          <w:i w:val="0"/>
+        </w:rPr>
+        <w:t>Chapter 10. Mixers and Frequency Planning</w:t>
+      </w:r>
+    </w:p>
+    <w:p>
+      <w:pPr/>
+      <w:r>
+        <w:rPr>
+          <w:i w:val="0"/>
+        </w:rPr>
+        <w:t>Every superheterodyne and zero-IF radio of Book 5 contains a mixer, the circuit that shifts a signal from one frequency to another by multiplying it with a local oscillator. A mixer is a deliberately nonlinear device, and it produces not only the wanted product but a family of unwanted ones. Choosing the intermediate and oscillator frequencies so that those products fall where filters can remove them is frequency planning, and it is one of the decisions that most shape a radio's architecture. This chapter covers mixer types and figures of merit, the image problem, and the spur chart.</w:t>
+      </w:r>
+    </w:p>
+    <w:p>
+      <w:pPr>
+        <w:pStyle w:val="Heading2"/>
+      </w:pPr>
+      <w:r>
+        <w:rPr>
+          <w:i w:val="0"/>
+        </w:rPr>
+        <w:t>10.1 What a mixer does</w:t>
+      </w:r>
+    </w:p>
+    <w:p>
+      <w:pPr/>
+      <w:r>
+        <w:rPr>
+          <w:i w:val="0"/>
+        </w:rPr>
+        <w:t>Multiplying a signal at fRF by an oscillator at fLO produces components at their sum and difference. The receiver keeps the difference, fIF = |fRF − fLO|; the transmitter keeps the sum or difference that lands at the carrier. A double-balanced mixer, a diode ring or a Gilbert cell of transistors, suppresses the oscillator and the input at its output port and cancels many even-order products. Passive mixers have a conversion loss of about 6 to 7 dB and a noise figure roughly equal to it, but very high intercept points; active Gilbert-cell mixers have conversion gain but lower linearity. The oscillator drive must be large enough to switch the mixer cleanly, and the oscillator's phase noise, Chapter 7's subject, is transferred onto every signal.</w:t>
+      </w:r>
+    </w:p>
+    <w:p>
+      <w:pPr>
+        <w:jc w:val="center"/>
+      </w:pPr>
+      <w:r>
+        <w:rPr>
+          <w:i w:val="0"/>
+        </w:rPr>
+        <w:t>fIF = |fRF − fLO|,   spurs at |m fLO ± n fRF| = fIF</w:t>
+      </w:r>
+    </w:p>
+    <w:p>
+      <w:pPr>
+        <w:pStyle w:val="Heading2"/>
+      </w:pPr>
+      <w:r>
+        <w:rPr>
+          <w:i w:val="0"/>
+        </w:rPr>
+        <w:t>10.2 The image</w:t>
+      </w:r>
+    </w:p>
+    <w:p>
+      <w:pPr/>
+      <w:r>
+        <w:rPr>
+          <w:i w:val="0"/>
+        </w:rPr>
+        <w:t>Two radio frequencies produce the same difference with a given oscillator: the wanted one, and the image on the opposite side of the oscillator at the same distance. A mixer cannot tell them apart, so the image must be removed before the mixer by a filter, or cancelled by an image-reject mixer that uses quadrature paths, as in Book 5's I/Q receiver. A high intermediate frequency puts the image far from the wanted band, where a filter can remove it easily, but makes the later IF filtering harder; a low IF does the opposite. Many receivers use two conversions to get both.</w:t>
+      </w:r>
+    </w:p>
+    <w:p>
+      <w:pPr>
+        <w:jc w:val="center"/>
+      </w:pPr>
+      <w:r>
+        <w:rPr>
+          <w:i w:val="0"/>
+        </w:rPr>
+        <w:t>fimage = fRF − 2fIF  (low-side LO),   fRF + 2fIF  (high-side LO)</w:t>
+      </w:r>
+    </w:p>
+    <w:p>
+      <w:pPr>
+        <w:pStyle w:val="Heading2"/>
+      </w:pPr>
+      <w:r>
+        <w:rPr>
+          <w:i w:val="0"/>
+        </w:rPr>
+        <w:t>Worked Example 10.1</w:t>
+      </w:r>
+    </w:p>
+    <w:p>
+      <w:pPr/>
+      <w:r>
+        <w:rPr>
+          <w:b/>
+        </w:rPr>
+        <w:t xml:space="preserve">Problem. </w:t>
+      </w:r>
+      <w:r>
+        <w:rPr>
+          <w:i w:val="0"/>
+        </w:rPr>
+        <w:t>A 2.45 GHz receiver uses a 400 MHz IF with low-side injection. Find the oscillator frequency and the image. An interferer at the image is 40 dB stronger than the wanted signal, which needs 20 dB of SNR. How much image rejection is needed?</w:t>
+      </w:r>
+    </w:p>
+    <w:p>
+      <w:pPr/>
+      <w:r>
+        <w:rPr>
+          <w:b/>
+        </w:rPr>
+        <w:t xml:space="preserve">Solution. </w:t>
+      </w:r>
+      <w:r>
+        <w:rPr>
+          <w:i w:val="0"/>
+        </w:rPr>
+        <w:t>fLO = 2.45 − 0.40 = 2.05 GHz, and the image is at 2.05 − 0.40 = 1.65 GHz, 800 MHz below the wanted signal. The image must end up at least 20 dB below the wanted signal after conversion, so the filter and mixer together must reject it by 40 + 20 = 60 dB. At an 800 MHz separation a modest ceramic filter can provide that; with a 40 MHz IF the image would be only 80 MHz away and would need a much sharper filter or an image-reject architecture.</w:t>
+      </w:r>
+    </w:p>
+    <w:p>
+      <w:pPr/>
+      <w:r>
+        <w:rPr>
+          <w:b/>
+        </w:rPr>
+        <w:t xml:space="preserve">Key idea. </w:t>
+      </w:r>
+      <w:r>
+        <w:rPr>
+          <w:i w:val="0"/>
+        </w:rPr>
+        <w:t>A mixer converts every input that satisfies |m fLO ± n fRF| = fIF, not only the one you want. Frequency planning places the oscillator and IF so that the image and the strong spurs land where a filter can remove them.</w:t>
+      </w:r>
+    </w:p>
+    <w:p>
+      <w:pPr>
+        <w:pStyle w:val="Heading2"/>
+      </w:pPr>
+      <w:r>
+        <w:rPr>
+          <w:i w:val="0"/>
+        </w:rPr>
+        <w:t>10.3 The spur chart</w:t>
+      </w:r>
+    </w:p>
+    <w:p>
+      <w:pPr/>
+      <w:r>
+        <w:rPr>
+          <w:i w:val="0"/>
+        </w:rPr>
+        <w:t>Because a real mixer is not an ideal multiplier, it converts inputs at every frequency where some combination m fLO ± n fRF equals the IF, with m and n small integers. Each such response, a spur, is weaker for higher orders, but a strong interferer at a low-order spur frequency can still block the receiver. The half-IF spur, with m = n = 2, lies halfway between the wanted signal and the oscillator, where it is hard to filter. A frequency plan lists the low-order spur frequencies, checks them against the filter's response and the expected interferers, and moves the IF if a dangerous spur falls in band.</w:t>
+      </w:r>
+    </w:p>
+    <w:p>
+      <w:pPr>
+        <w:pStyle w:val="Heading2"/>
+      </w:pPr>
+      <w:r>
+        <w:rPr>
+          <w:i w:val="0"/>
+        </w:rPr>
+        <w:t>Worked Example 10.2</w:t>
+      </w:r>
+    </w:p>
+    <w:p>
+      <w:pPr/>
+      <w:r>
+        <w:rPr>
+          <w:b/>
+        </w:rPr>
+        <w:t xml:space="preserve">Problem. </w:t>
+      </w:r>
+      <w:r>
+        <w:rPr>
+          <w:i w:val="0"/>
+        </w:rPr>
+        <w:t>For the receiver of Example 10.1, find the radio frequencies between 1 and 4 GHz that convert to the 400 MHz IF for m and n up to 3.</w:t>
+      </w:r>
+    </w:p>
+    <w:p>
+      <w:pPr/>
+      <w:r>
+        <w:rPr>
+          <w:b/>
+        </w:rPr>
+        <w:t xml:space="preserve">Solution. </w:t>
+      </w:r>
+      <w:r>
+        <w:rPr>
+          <w:i w:val="0"/>
+        </w:rPr>
+        <w:t>Solving m × 2.05 ± n fRF = ±0.40 gives, for (m, n) = (1, 1), the wanted 2.45 GHz and the image 1.65 GHz. For (1, 2), 1.225 GHz. For (2, 1), 3.70 GHz. For (2, 2), 2.25 GHz and 1.85 GHz; 2.25 GHz is the half-IF spur, only 200 MHz below the wanted signal. For (2, 3), 1.50 and 1.233 GHz; for (3, 2), 3.275 and 2.875 GHz; for (3, 3), 2.183 and 1.917 GHz. The front-end filter must reject the half-IF spur at 2.25 GHz and the (3, 3) response at 2.183 GHz, both near the band; the others are far enough away to be easy.</w:t>
+      </w:r>
+    </w:p>
+    <w:p>
+      <w:pPr>
+        <w:pStyle w:val="Heading2"/>
+      </w:pPr>
+      <w:r>
+        <w:rPr>
+          <w:i w:val="0"/>
+        </w:rPr>
+        <w:t>10.4 Transmit mixers and direct conversion</w:t>
+      </w:r>
+    </w:p>
+    <w:p>
+      <w:pPr/>
+      <w:r>
+        <w:rPr>
+          <w:i w:val="0"/>
+        </w:rPr>
+        <w:t>A transmitter that upconverts with a mixer produces the wanted sideband, the image sideband, and oscillator leakage, all of which the emission mask of Book 7 constrains. Quadrature upconverters cancel the image sideband to the extent that their I and Q paths match, the same imbalance arithmetic as in Book 5's receiver, and they null the oscillator leakage by trimming DC offsets. Direct conversion, with the oscillator at the carrier, avoids the image entirely but places the oscillator in band, where its leakage, pulling by the power amplifier, and radiation must be controlled. Many modern transmitters avoid analog mixers altogether by synthesizing the signal digitally at a high rate and converting it with a fast DAC directly at the carrier.</w:t>
+      </w:r>
+    </w:p>
+    <w:p>
+      <w:pPr>
+        <w:pStyle w:val="Heading2"/>
+      </w:pPr>
+      <w:r>
+        <w:rPr>
+          <w:i w:val="0"/>
+        </w:rPr>
+        <w:t>Practice</w:t>
+      </w:r>
+    </w:p>
+    <w:p>
+      <w:pPr/>
+      <w:r>
+        <w:rPr>
+          <w:b/>
+        </w:rPr>
+        <w:t xml:space="preserve">1. </w:t>
+      </w:r>
+      <w:r>
+        <w:rPr>
+          <w:i w:val="0"/>
+        </w:rPr>
+        <w:t>Find the image of a 5.8 GHz signal with a high-side LO and a 1 GHz IF.</w:t>
+      </w:r>
+    </w:p>
+    <w:p>
+      <w:pPr/>
+      <w:r>
+        <w:rPr>
+          <w:b/>
+        </w:rPr>
+        <w:t xml:space="preserve">2. </w:t>
+      </w:r>
+      <w:r>
+        <w:rPr>
+          <w:i w:val="0"/>
+        </w:rPr>
+        <w:t>Find the half-IF spur for a 900 MHz receiver with a 70 MHz IF and low-side LO.</w:t>
+      </w:r>
+    </w:p>
+    <w:p>
+      <w:pPr/>
+      <w:r>
+        <w:rPr>
+          <w:b/>
+        </w:rPr>
+        <w:t xml:space="preserve">3. </w:t>
+      </w:r>
+      <w:r>
+        <w:rPr>
+          <w:i w:val="0"/>
+        </w:rPr>
+        <w:t>An image interferer 30 dB above the wanted signal must end 15 dB below it. How much rejection is needed?</w:t>
+      </w:r>
+    </w:p>
+    <w:p>
+      <w:pPr/>
+      <w:r>
+        <w:rPr>
+          <w:b/>
+        </w:rPr>
+        <w:t xml:space="preserve">4. </w:t>
+      </w:r>
+      <w:r>
+        <w:rPr>
+          <w:i w:val="0"/>
+        </w:rPr>
+        <w:t>A passive mixer has 6.5 dB conversion loss. Estimate its noise figure.</w:t>
+      </w:r>
+    </w:p>
+    <w:p>
+      <w:pPr/>
+      <w:r>
+        <w:rPr>
+          <w:b/>
+        </w:rPr>
+        <w:t xml:space="preserve">5. </w:t>
+      </w:r>
+      <w:r>
+        <w:rPr>
+          <w:i w:val="0"/>
+        </w:rPr>
+        <w:t>Why does a higher IF make image rejection easier?</w:t>
+      </w:r>
+    </w:p>
+    <w:p>
+      <w:pPr/>
+      <w:r>
+        <w:rPr>
+          <w:b/>
+        </w:rPr>
+        <w:t xml:space="preserve">6. </w:t>
+      </w:r>
+      <w:r>
+        <w:rPr>
+          <w:i w:val="0"/>
+        </w:rPr>
+        <w:t>Why does a direct-conversion transmitter need careful control of LO leakage?</w:t>
+      </w:r>
+    </w:p>
+    <w:p>
+      <w:pPr>
+        <w:pStyle w:val="Heading1"/>
+      </w:pPr>
+      <w:r>
+        <w:rPr>
+          <w:i w:val="0"/>
+        </w:rPr>
+        <w:t>Chapter 11. The Link Budget</w:t>
+      </w:r>
+    </w:p>
+    <w:p>
+      <w:pPr/>
+      <w:r>
+        <w:rPr>
+          <w:i w:val="0"/>
+        </w:rPr>
+        <w:t>A link budget adds up every gain and loss between the transmitter's output and the receiver's detector and compares the result with what the demodulator needs. It ties together almost every topic in this book and Book 5: power amplifier output, feeder loss, antenna gain, path loss, receiver noise, and the SNR or Eb/N0 that a modulation needs. Because everything is in decibels, the budget is a column of additions, and the bottom line, the margin, says how much fading or degradation the link can tolerate. This chapter builds a terrestrial budget in dBm and a satellite budget in the G/T form.</w:t>
+      </w:r>
+    </w:p>
+    <w:p>
+      <w:pPr>
+        <w:pStyle w:val="Heading2"/>
+      </w:pPr>
+      <w:r>
+        <w:rPr>
+          <w:i w:val="0"/>
+        </w:rPr>
+        <w:t>11.1 The terrestrial budget</w:t>
+      </w:r>
+    </w:p>
+    <w:p>
+      <w:pPr/>
+      <w:r>
+        <w:rPr>
+          <w:i w:val="0"/>
+        </w:rPr>
+        <w:t>The received power is the transmitter power, minus the feeder losses, plus both antenna gains, minus the path loss. In free space the path loss is the Friis term, which grows 20 dB per decade of distance and 20 dB per decade of frequency. The fade margin is the received power minus the receiver's sensitivity, which Book 4 defined as the noise floor plus the noise figure plus the required SNR. Real paths add atmospheric absorption, rain at millimeter waves, obstruction of the Fresnel zone, and multipath fading, so a microwave link is usually designed for a margin of 20 to 40 dB depending on the availability required.</w:t>
+      </w:r>
+    </w:p>
+    <w:p>
+      <w:pPr>
+        <w:jc w:val="center"/>
+      </w:pPr>
+      <w:r>
+        <w:rPr>
+          <w:i w:val="0"/>
+        </w:rPr>
+        <w:t>Pr = Pt − Lt + Gt − Lpath + Gr − Lr,   Lpath = 20 log10(4πd f / c)</w:t>
+      </w:r>
+    </w:p>
+    <w:p>
+      <w:pPr>
+        <w:pStyle w:val="Heading2"/>
+      </w:pPr>
+      <w:r>
+        <w:rPr>
+          <w:i w:val="0"/>
+        </w:rPr>
+        <w:t>Worked Example 11.1</w:t>
+      </w:r>
+    </w:p>
+    <w:p>
+      <w:pPr/>
+      <w:r>
+        <w:rPr>
+          <w:b/>
+        </w:rPr>
+        <w:t xml:space="preserve">Problem. </w:t>
+      </w:r>
+      <w:r>
+        <w:rPr>
+          <w:i w:val="0"/>
+        </w:rPr>
+        <w:t>A 5.8 GHz point-to-point link spans 10 km. The transmitter delivers 27 dBm, each feeder loses 1 dB, each antenna has 25 dBi, and the receiver sensitivity is −80 dBm. Find the path loss, the received power, and the fade margin.</w:t>
+      </w:r>
+    </w:p>
+    <w:p>
+      <w:pPr/>
+      <w:r>
+        <w:rPr>
+          <w:b/>
+        </w:rPr>
+        <w:t xml:space="preserve">Solution. </w:t>
+      </w:r>
+      <w:r>
+        <w:rPr>
+          <w:i w:val="0"/>
+        </w:rPr>
+        <w:t>Path loss = 20 log10(4π × 10⁴ × 5.8 × 10⁹ / 2.998 × 10⁸) = 127.7 dB. Received power = 27 − 1 + 25 − 127.7 + 25 − 1 = −52.7 dBm. The fade margin is −52.7 − (−80) = 27.3 dB, comfortable for a clear line-of-sight path at this frequency. Doubling the distance to 20 km would add 6.0 dB of path loss and leave 21.3 dB.</w:t>
+      </w:r>
+    </w:p>
+    <w:p>
+      <w:pPr/>
+      <w:r>
+        <w:rPr>
+          <w:b/>
+        </w:rPr>
+        <w:t xml:space="preserve">Key idea. </w:t>
+      </w:r>
+      <w:r>
+        <w:rPr>
+          <w:i w:val="0"/>
+        </w:rPr>
+        <w:t>A link budget is a sum in decibels: transmit power plus antenna gains minus losses gives the received power, and the margin over the receiver's sensitivity is what protects the link against fading.</w:t>
+      </w:r>
+    </w:p>
+    <w:p>
+      <w:pPr>
+        <w:pStyle w:val="Heading2"/>
+      </w:pPr>
+      <w:r>
+        <w:rPr>
+          <w:i w:val="0"/>
+        </w:rPr>
+        <w:t>11.2 The satellite budget and G/T</w:t>
+      </w:r>
+    </w:p>
+    <w:p>
+      <w:pPr/>
+      <w:r>
+        <w:rPr>
+          <w:i w:val="0"/>
+        </w:rPr>
+        <w:t>Satellite links use a different bookkeeping. The transmitter's power and antenna are combined into the effective isotropic radiated power, EIRP, in dBW. The receiver's antenna gain and system noise temperature are combined into a figure of merit, G/T, in dB/K, because a larger antenna and a quieter receiver are interchangeable ways of improving the link. The carrier-to-noise-density ratio then follows from Boltzmann's constant, −228.6 dBW/K/Hz, and dividing by the noise bandwidth gives C/N. The system temperature is the antenna temperature, the sky noise the antenna sees, plus the receiver's equivalent temperature Te = 290(F − 1).</w:t>
+      </w:r>
+    </w:p>
+    <w:p>
+      <w:pPr>
+        <w:jc w:val="center"/>
+      </w:pPr>
+      <w:r>
+        <w:rPr>
+          <w:i w:val="0"/>
+        </w:rPr>
+        <w:t>C/N0 = EIRP − Lpath + G/T − k  (dBHz),   C/N = C/N0 − 10 log10 B</w:t>
+      </w:r>
+    </w:p>
+    <w:p>
+      <w:pPr>
+        <w:pStyle w:val="Heading2"/>
+      </w:pPr>
+      <w:r>
+        <w:rPr>
+          <w:i w:val="0"/>
+        </w:rPr>
+        <w:t>Worked Example 11.2</w:t>
+      </w:r>
+    </w:p>
+    <w:p>
+      <w:pPr/>
+      <w:r>
+        <w:rPr>
+          <w:b/>
+        </w:rPr>
+        <w:t xml:space="preserve">Problem. </w:t>
+      </w:r>
+      <w:r>
+        <w:rPr>
+          <w:i w:val="0"/>
+        </w:rPr>
+        <w:t>A Ku-band satellite at 12 GHz is 38,000 km from the ground station. Its EIRP is 52 dBW; the ground terminal's G/T is 15 dB/K. Find C/N0 and the C/N in a 30 MHz channel, clear sky and with a 3 dB rain fade.</w:t>
+      </w:r>
+    </w:p>
+    <w:p>
+      <w:pPr/>
+      <w:r>
+        <w:rPr>
+          <w:b/>
+        </w:rPr>
+        <w:t xml:space="preserve">Solution. </w:t>
+      </w:r>
+      <w:r>
+        <w:rPr>
+          <w:i w:val="0"/>
+        </w:rPr>
+        <w:t>Path loss = 20 log10(4π × 3.8 × 10⁷ × 1.2 × 10¹⁰ / 2.998 × 10⁸) = 205.6 dB. C/N0 = 52 − 205.6 + 15 + 228.6 = 90.0 dBHz. In 30 MHz, 10 log10(3 × 10⁷) = 74.8 dB, so C/N = 15.2 dB in clear sky and 12.2 dB in the rain fade (strictly, rain also raises the sky noise and so lowers G/T a little more). Both exceed the roughly 6 to 10 dB that common satellite modulation and coding formats need.</w:t>
+      </w:r>
+    </w:p>
+    <w:p>
+      <w:pPr>
+        <w:pStyle w:val="Heading2"/>
+      </w:pPr>
+      <w:r>
+        <w:rPr>
+          <w:i w:val="0"/>
+        </w:rPr>
+        <w:t>Worked Example 11.3</w:t>
+      </w:r>
+    </w:p>
+    <w:p>
+      <w:pPr/>
+      <w:r>
+        <w:rPr>
+          <w:b/>
+        </w:rPr>
+        <w:t xml:space="preserve">Problem. </w:t>
+      </w:r>
+      <w:r>
+        <w:rPr>
+          <w:i w:val="0"/>
+        </w:rPr>
+        <w:t>A ground antenna has 40 dBi of gain and sees an antenna temperature of 50 K. Its LNA has a 0.8 dB noise figure. Find the system temperature and G/T.</w:t>
+      </w:r>
+    </w:p>
+    <w:p>
+      <w:pPr/>
+      <w:r>
+        <w:rPr>
+          <w:b/>
+        </w:rPr>
+        <w:t xml:space="preserve">Solution. </w:t>
+      </w:r>
+      <w:r>
+        <w:rPr>
+          <w:i w:val="0"/>
+        </w:rPr>
+        <w:t>Te = 290(10^0.08 − 1) = 58.7 K, so Tsys = 50 + 58.7 = 108.7 K, or 20.4 dBK. G/T = 40 − 20.4 = 19.6 dB/K. If the system temperature were 150 K, G/T would fall to 18.2 dB/K; the quieter LNA is worth about 1.4 dB, the same as a 17% larger dish diameter.</w:t>
+      </w:r>
+    </w:p>
+    <w:p>
+      <w:pPr>
+        <w:pStyle w:val="Heading2"/>
+      </w:pPr>
+      <w:r>
+        <w:rPr>
+          <w:i w:val="0"/>
+        </w:rPr>
+        <w:t>11.3 Margins and availability</w:t>
+      </w:r>
+    </w:p>
+    <w:p>
+      <w:pPr/>
+      <w:r>
+        <w:rPr>
+          <w:i w:val="0"/>
+        </w:rPr>
+        <w:t>The margin a link needs depends on how often it may fail. Rain fading at frequencies above about 10 GHz is described statistically: a link designed for 99.99% availability, about 53 minutes of outage per year, needs far more rain margin than one designed for 99.9%. Multipath fading on terrestrial links is countered by diversity, two antennas spaced vertically or two frequencies, rather than by power alone. Adaptive modulation, as in Book 5, trades throughput for margin, dropping to a robust format during a fade instead of losing the link.</w:t>
+      </w:r>
+    </w:p>
+    <w:p>
+      <w:pPr>
+        <w:pStyle w:val="Heading2"/>
+      </w:pPr>
+      <w:r>
+        <w:rPr>
+          <w:i w:val="0"/>
+        </w:rPr>
+        <w:t>Practice</w:t>
+      </w:r>
+    </w:p>
+    <w:p>
+      <w:pPr/>
+      <w:r>
+        <w:rPr>
+          <w:b/>
+        </w:rPr>
+        <w:t xml:space="preserve">1. </w:t>
+      </w:r>
+      <w:r>
+        <w:rPr>
+          <w:i w:val="0"/>
+        </w:rPr>
+        <w:t>Find the free-space path loss at 24 GHz over 2 km.</w:t>
+      </w:r>
+    </w:p>
+    <w:p>
+      <w:pPr/>
+      <w:r>
+        <w:rPr>
+          <w:b/>
+        </w:rPr>
+        <w:t xml:space="preserve">2. </w:t>
+      </w:r>
+      <w:r>
+        <w:rPr>
+          <w:i w:val="0"/>
+        </w:rPr>
+        <w:t>A link has 20 dBm transmit power, 30 dBi antennas at both ends, no feeder loss, and 120 dB path loss. Find the received power.</w:t>
+      </w:r>
+    </w:p>
+    <w:p>
+      <w:pPr/>
+      <w:r>
+        <w:rPr>
+          <w:b/>
+        </w:rPr>
+        <w:t xml:space="preserve">3. </w:t>
+      </w:r>
+      <w:r>
+        <w:rPr>
+          <w:i w:val="0"/>
+        </w:rPr>
+        <w:t>A 20 GHz satellite at 36,000 km has an EIRP of 50 dBW. The terminal's G/T is 10 dB/K. Find C/N in 10 MHz.</w:t>
+      </w:r>
+    </w:p>
+    <w:p>
+      <w:pPr/>
+      <w:r>
+        <w:rPr>
+          <w:b/>
+        </w:rPr>
+        <w:t xml:space="preserve">4. </w:t>
+      </w:r>
+      <w:r>
+        <w:rPr>
+          <w:i w:val="0"/>
+        </w:rPr>
+        <w:t>An LNA has a noise figure of 1.5 dB. Find its equivalent noise temperature.</w:t>
+      </w:r>
+    </w:p>
+    <w:p>
+      <w:pPr/>
+      <w:r>
+        <w:rPr>
+          <w:b/>
+        </w:rPr>
+        <w:t xml:space="preserve">5. </w:t>
+      </w:r>
+      <w:r>
+        <w:rPr>
+          <w:i w:val="0"/>
+        </w:rPr>
+        <w:t>How much path loss is added by tripling the distance?</w:t>
+      </w:r>
+    </w:p>
+    <w:p>
+      <w:pPr/>
+      <w:r>
+        <w:rPr>
+          <w:b/>
+        </w:rPr>
+        <w:t xml:space="preserve">6. </w:t>
+      </w:r>
+      <w:r>
+        <w:rPr>
+          <w:i w:val="0"/>
+        </w:rPr>
+        <w:t>Why is G/T a useful single figure of merit for a receiving station?</w:t>
+      </w:r>
+    </w:p>
+    <w:p>
+      <w:pPr>
+        <w:pStyle w:val="Heading1"/>
+      </w:pPr>
+      <w:r>
+        <w:rPr>
+          <w:i w:val="0"/>
+        </w:rPr>
+        <w:t>Chapter 12. Bias, Ruggedness, and Protection</w:t>
+      </w:r>
+    </w:p>
+    <w:p>
+      <w:pPr/>
+      <w:r>
+        <w:rPr>
+          <w:i w:val="0"/>
+        </w:rPr>
+        <w:t>A power amplifier that meets every specification on the bench can still fail in the field: an antenna is disconnected, a connector corrodes, the supply comes up in the wrong order, or the device heats and its bias drifts. This chapter covers the practical engineering that keeps the amplifier of Chapters 2 to 5 alive: setting and stabilizing the bias, surviving a mismatched load, and detecting faults fast enough to act on them.</w:t>
+      </w:r>
+    </w:p>
+    <w:p>
+      <w:pPr>
+        <w:pStyle w:val="Heading2"/>
+      </w:pPr>
+      <w:r>
+        <w:rPr>
+          <w:i w:val="0"/>
+        </w:rPr>
+        <w:t>12.1 Biasing the device</w:t>
+      </w:r>
+    </w:p>
+    <w:p>
+      <w:pPr/>
+      <w:r>
+        <w:rPr>
+          <w:i w:val="0"/>
+        </w:rPr>
+        <w:t>The quiescent current sets the amplifier's class and therefore its linearity and efficiency, so it must be set accurately and held there as temperature changes. A gallium nitride or LDMOS transistor is biased by its gate voltage; for depletion-mode GaN that voltage is negative, a few volts below zero, and the drain must not be powered while the gate is at zero, because the device is then fully on. The safe sequence is gate negative first, then drain on, and on shutdown drain off first, then gate. Bipolar devices bring the opposite hazard: the base-emitter voltage needed for a given current falls by about 2 mV for each kelvin of temperature rise, so a fixed bias voltage gives a current that rises as the device heats, which heats it further. Emitter ballast resistors and bias circuits that track the device's temperature, often a diode or a scaled transistor on the same die, break that loop.</w:t>
+      </w:r>
+    </w:p>
+    <w:p>
+      <w:pPr>
+        <w:jc w:val="center"/>
+      </w:pPr>
+      <w:r>
+        <w:rPr>
+          <w:i w:val="0"/>
+        </w:rPr>
+        <w:t>ΔVBE ≈ −2 mV/K,   IC ∝ exp(ΔV/VT),   VT = kT/q ≈ 25.9 mV</w:t>
+      </w:r>
+    </w:p>
+    <w:p>
+      <w:pPr>
+        <w:pStyle w:val="Heading2"/>
+      </w:pPr>
+      <w:r>
+        <w:rPr>
+          <w:i w:val="0"/>
+        </w:rPr>
+        <w:t>Worked Example 12.1</w:t>
+      </w:r>
+    </w:p>
+    <w:p>
+      <w:pPr/>
+      <w:r>
+        <w:rPr>
+          <w:b/>
+        </w:rPr>
+        <w:t xml:space="preserve">Problem. </w:t>
+      </w:r>
+      <w:r>
+        <w:rPr>
+          <w:i w:val="0"/>
+        </w:rPr>
+        <w:t>A bipolar stage is biased with a fixed base-emitter voltage. Its junction warms by 10 K. By what factor does the collector current rise if nothing compensates?</w:t>
+      </w:r>
+    </w:p>
+    <w:p>
+      <w:pPr/>
+      <w:r>
+        <w:rPr>
+          <w:b/>
+        </w:rPr>
+        <w:t xml:space="preserve">Solution. </w:t>
+      </w:r>
+      <w:r>
+        <w:rPr>
+          <w:i w:val="0"/>
+        </w:rPr>
+        <w:t>A 10 K rise is equivalent to a 20 mV increase in the effective drive. The current scales as exp(0.020 / 0.02585) = 2.17, more than doubling. The extra current raises dissipation and temperature further; with enough thermal resistance the loop runs away. A ballast resistor that drops even a few tens of millivolts at the operating current provides negative feedback that stops it.</w:t>
+      </w:r>
+    </w:p>
+    <w:p>
+      <w:pPr>
+        <w:pStyle w:val="Heading2"/>
+      </w:pPr>
+      <w:r>
+        <w:rPr>
+          <w:i w:val="0"/>
+        </w:rPr>
+        <w:t>12.2 The mismatched load</w:t>
+      </w:r>
+    </w:p>
+    <w:p>
+      <w:pPr/>
+      <w:r>
+        <w:rPr>
+          <w:i w:val="0"/>
+        </w:rPr>
+        <w:t>An amplifier designed for a 50 Ω load sees something else when the antenna is damaged, iced, or missing. The voltage standing-wave ratio describes the mismatch: the reflection coefficient is |Γ| = (VSWR − 1)/(VSWR + 1), and a fraction |Γ|² of the forward power returns toward the amplifier. Along the line the incident and reflected waves add, so at some points the voltage reaches (1 + |Γ|) times the matched value. Depending on the phase of the reflection, the device sees either that excess voltage or a corresponding excess current. Ruggedness specifications state the VSWR, often 10:1 at all phases, that a device survives without damage.</w:t>
+      </w:r>
+    </w:p>
+    <w:p>
+      <w:pPr>
+        <w:jc w:val="center"/>
+      </w:pPr>
+      <w:r>
+        <w:rPr>
+          <w:i w:val="0"/>
+        </w:rPr>
+        <w:t>|Γ| = (VSWR − 1)/(VSWR + 1),   Prefl = |Γ|² Pfwd,   Vpeak,max = (1 + |Γ|) Vpeak</w:t>
+      </w:r>
+    </w:p>
+    <w:p>
+      <w:pPr>
+        <w:pStyle w:val="Heading2"/>
+      </w:pPr>
+      <w:r>
+        <w:rPr>
+          <w:i w:val="0"/>
+        </w:rPr>
+        <w:t>Worked Example 12.2</w:t>
+      </w:r>
+    </w:p>
+    <w:p>
+      <w:pPr/>
+      <w:r>
+        <w:rPr>
+          <w:b/>
+        </w:rPr>
+        <w:t xml:space="preserve">Problem. </w:t>
+      </w:r>
+      <w:r>
+        <w:rPr>
+          <w:i w:val="0"/>
+        </w:rPr>
+        <w:t>A 100 W amplifier into 50 Ω faces a 10:1 VSWR. Find the reflection coefficient, the reflected power, and the worst-case peak voltage on the line.</w:t>
+      </w:r>
+    </w:p>
+    <w:p>
+      <w:pPr/>
+      <w:r>
+        <w:rPr>
+          <w:b/>
+        </w:rPr>
+        <w:t xml:space="preserve">Solution. </w:t>
+      </w:r>
+      <w:r>
+        <w:rPr>
+          <w:i w:val="0"/>
+        </w:rPr>
+        <w:t>|Γ| = 9/11 = 0.818. Reflected power = 0.818² × 100 = 66.9 W. The matched peak voltage is √(2 × 100 × 50) = 100 V, so the worst case is 100 × 1.818 = 181.8 V, nearly twice the design value, applied through the matching network to the device. The return loss is only 1.74 dB.</w:t>
+      </w:r>
+    </w:p>
+    <w:p>
+      <w:pPr/>
+      <w:r>
+        <w:rPr>
+          <w:b/>
+        </w:rPr>
+        <w:t xml:space="preserve">Key idea. </w:t>
+      </w:r>
+      <w:r>
+        <w:rPr>
+          <w:i w:val="0"/>
+        </w:rPr>
+        <w:t>A severe mismatch reflects most of the power and nearly doubles the peak voltage or current somewhere in the output network. The amplifier survives either because the device is rated for it, because an isolator absorbs the reflection, or because protection cuts the drive before damage occurs.</w:t>
+      </w:r>
+    </w:p>
+    <w:p>
+      <w:pPr>
+        <w:pStyle w:val="Heading2"/>
+      </w:pPr>
+      <w:r>
+        <w:rPr>
+          <w:i w:val="0"/>
+        </w:rPr>
+        <w:t>12.3 Detecting faults and acting on them</w:t>
+      </w:r>
+    </w:p>
+    <w:p>
+      <w:pPr/>
+      <w:r>
+        <w:rPr>
+          <w:i w:val="0"/>
+        </w:rPr>
+        <w:t>A directional coupler at the output samples the forward and reflected waves separately, and diode or log detectors convert them to voltages. Comparing the two gives the VSWR continuously. Protection logic reduces the drive, the supply, or both, when the reflected power or the device temperature exceeds a threshold, and shuts down entirely on a severe fault. The response must be fast: a GaN device can be destroyed in microseconds by an overvoltage, so the first line of defense is often analog, with digital supervision setting the limits and logging events. The same coupler feeds the closed-loop power control that holds the output at its set value as temperature and supply vary.</w:t>
+      </w:r>
+    </w:p>
+    <w:p>
+      <w:pPr>
+        <w:pStyle w:val="Heading2"/>
+      </w:pPr>
+      <w:r>
+        <w:rPr>
+          <w:i w:val="0"/>
+        </w:rPr>
+        <w:t>Worked Example 12.3</w:t>
+      </w:r>
+    </w:p>
+    <w:p>
+      <w:pPr/>
+      <w:r>
+        <w:rPr>
+          <w:b/>
+        </w:rPr>
+        <w:t xml:space="preserve">Problem. </w:t>
+      </w:r>
+      <w:r>
+        <w:rPr>
+          <w:i w:val="0"/>
+        </w:rPr>
+        <w:t>The amplifier of Example 12.2 has a 30 dB reverse coupler. What power does the reflected-power detector see at a 10:1 VSWR, and at 1.5:1?</w:t>
+      </w:r>
+    </w:p>
+    <w:p>
+      <w:pPr/>
+      <w:r>
+        <w:rPr>
+          <w:b/>
+        </w:rPr>
+        <w:t xml:space="preserve">Solution. </w:t>
+      </w:r>
+      <w:r>
+        <w:rPr>
+          <w:i w:val="0"/>
+        </w:rPr>
+        <w:t>At 10:1 the reflected power is 66.9 W, 48.3 dBm, so the detector sees 18.3 dBm. At 1.5:1, |Γ| = 0.2 and the reflected power is 0.04 × 100 = 4 W, 36.0 dBm, so the detector sees 6.0 dBm. The 12 dB difference is easy to resolve, though the coupler's finite directivity, the forward signal leaking into the reverse port, limits how small a mismatch can be measured.</w:t>
+      </w:r>
+    </w:p>
+    <w:p>
+      <w:pPr>
+        <w:pStyle w:val="Heading2"/>
+      </w:pPr>
+      <w:r>
+        <w:rPr>
+          <w:i w:val="0"/>
+        </w:rPr>
+        <w:t>12.4 Supply, overdrive, and inrush</w:t>
+      </w:r>
+    </w:p>
+    <w:p>
+      <w:pPr/>
+      <w:r>
+        <w:rPr>
+          <w:i w:val="0"/>
+        </w:rPr>
+        <w:t>Other common failures come from the supply and the input. An overdrive pushes the device deep into compression, raising its dissipation and the voltage swing; input limiters and drive monitoring guard against it. A supply that overshoots at turn-on can exceed the drain breakdown rating, and the large decoupling capacitors at the drain draw a heavy inrush that soft-start circuits limit. Load pulling at turn-on, with the antenna switch or duplexer not yet settled, can momentarily present a bad load. A good design treats each of these as a specified condition, tested at the extremes of temperature and supply.</w:t>
+      </w:r>
+    </w:p>
+    <w:p>
+      <w:pPr>
+        <w:pStyle w:val="Heading2"/>
+      </w:pPr>
+      <w:r>
+        <w:rPr>
+          <w:i w:val="0"/>
+        </w:rPr>
+        <w:t>Practice</w:t>
+      </w:r>
+    </w:p>
+    <w:p>
+      <w:pPr/>
+      <w:r>
+        <w:rPr>
+          <w:b/>
+        </w:rPr>
+        <w:t xml:space="preserve">1. </w:t>
+      </w:r>
+      <w:r>
+        <w:rPr>
+          <w:i w:val="0"/>
+        </w:rPr>
+        <w:t>Find |Γ|, the return loss, and the reflected fraction for a VSWR of 2:1.</w:t>
+      </w:r>
+    </w:p>
+    <w:p>
+      <w:pPr/>
+      <w:r>
+        <w:rPr>
+          <w:b/>
+        </w:rPr>
+        <w:t xml:space="preserve">2. </w:t>
+      </w:r>
+      <w:r>
+        <w:rPr>
+          <w:i w:val="0"/>
+        </w:rPr>
+        <w:t>A 50 W amplifier into 50 Ω sees a 5:1 VSWR. Find the matched and worst-case peak voltages.</w:t>
+      </w:r>
+    </w:p>
+    <w:p>
+      <w:pPr/>
+      <w:r>
+        <w:rPr>
+          <w:b/>
+        </w:rPr>
+        <w:t xml:space="preserve">3. </w:t>
+      </w:r>
+      <w:r>
+        <w:rPr>
+          <w:i w:val="0"/>
+        </w:rPr>
+        <w:t>At a 3:1 VSWR, how much of the forward power reaches the load, in dB?</w:t>
+      </w:r>
+    </w:p>
+    <w:p>
+      <w:pPr/>
+      <w:r>
+        <w:rPr>
+          <w:b/>
+        </w:rPr>
+        <w:t xml:space="preserve">4. </w:t>
+      </w:r>
+      <w:r>
+        <w:rPr>
+          <w:i w:val="0"/>
+        </w:rPr>
+        <w:t>Why must a depletion-mode GaN amplifier's gate be biased before its drain is powered?</w:t>
+      </w:r>
+    </w:p>
+    <w:p>
+      <w:pPr/>
+      <w:r>
+        <w:rPr>
+          <w:b/>
+        </w:rPr>
+        <w:t xml:space="preserve">5. </w:t>
+      </w:r>
+      <w:r>
+        <w:rPr>
+          <w:i w:val="0"/>
+        </w:rPr>
+        <w:t>What does a directional coupler's directivity limit?</w:t>
+      </w:r>
+    </w:p>
+    <w:p>
+      <w:pPr/>
+      <w:r>
+        <w:rPr>
+          <w:b/>
+        </w:rPr>
+        <w:t xml:space="preserve">6. </w:t>
+      </w:r>
+      <w:r>
+        <w:rPr>
+          <w:i w:val="0"/>
+        </w:rPr>
+        <w:t>Why do bipolar power stages use emitter ballast resistors?</w:t>
+      </w:r>
+    </w:p>
+    <w:p>
+      <w:pPr>
+        <w:pStyle w:val="Heading1"/>
+      </w:pPr>
+      <w:r>
+        <w:rPr>
+          <w:i w:val="0"/>
+        </w:rPr>
+        <w:t>Chapter 13. Vacuum Tubes: Klystrons, TWTs, and Magnetrons</w:t>
+      </w:r>
+    </w:p>
+    <w:p>
+      <w:pPr/>
+      <w:r>
+        <w:rPr>
+          <w:i w:val="0"/>
+        </w:rPr>
+        <w:t>Solid-state amplifiers have replaced vacuum tubes in most radios, but not everywhere. Where the power is kilowatts to megawatts, the frequency is very high, or the device must survive radiation and heat in orbit, electron beams in vacuum still win. Satellite transponders use traveling-wave tubes, particle accelerators and broadcast transmitters use klystrons and inductive output tubes, every microwave oven contains a magnetron, and fusion experiments heat plasma with gyrotrons. This chapter explains how a beam of electrons in vacuum amplifies a microwave signal and where each type fits.</w:t>
+      </w:r>
+    </w:p>
+    <w:p>
+      <w:pPr>
+        <w:pStyle w:val="Heading2"/>
+      </w:pPr>
+      <w:r>
+        <w:rPr>
+          <w:i w:val="0"/>
+        </w:rPr>
+        <w:t>13.1 The electron beam</w:t>
+      </w:r>
+    </w:p>
+    <w:p>
+      <w:pPr/>
+      <w:r>
+        <w:rPr>
+          <w:i w:val="0"/>
+        </w:rPr>
+        <w:t>A heated cathode emits electrons, and a high voltage accelerates them into a beam. The beam's DC power is its voltage times its current, and the tube's job is to convert part of that kinetic energy into RF. The current a gun can draw at a given voltage follows the Child-Langmuir law, I = K V^(3/2), where the constant K, the perveance, depends only on the gun's geometry; perveances around 0.5 to 2 microperveance (µperv, 10⁻⁶ A/V^1.5) are typical. At tens of kilovolts the electrons move at a sizable fraction of the speed of light, which is what lets the beam interact with a slow electromagnetic wave.</w:t>
+      </w:r>
+    </w:p>
+    <w:p>
+      <w:pPr>
+        <w:jc w:val="center"/>
+      </w:pPr>
+      <w:r>
+        <w:rPr>
+          <w:i w:val="0"/>
+        </w:rPr>
+        <w:t>Pbeam = V I,   I = K V^(3/2),   v = c√(1 − 1/γ²),  γ = 1 + eV/(mc²)</w:t>
+      </w:r>
+    </w:p>
+    <w:p>
+      <w:pPr>
+        <w:pStyle w:val="Heading2"/>
+      </w:pPr>
+      <w:r>
+        <w:rPr>
+          <w:i w:val="0"/>
+        </w:rPr>
+        <w:t>Worked Example 13.1</w:t>
+      </w:r>
+    </w:p>
+    <w:p>
+      <w:pPr/>
+      <w:r>
+        <w:rPr>
+          <w:b/>
+        </w:rPr>
+        <w:t xml:space="preserve">Problem. </w:t>
+      </w:r>
+      <w:r>
+        <w:rPr>
+          <w:i w:val="0"/>
+        </w:rPr>
+        <w:t>A tube's gun runs at 10 kV and 0.5 A. Find the beam power, the perveance, the electron velocity, and the RF output at 40% efficiency.</w:t>
+      </w:r>
+    </w:p>
+    <w:p>
+      <w:pPr/>
+      <w:r>
+        <w:rPr>
+          <w:b/>
+        </w:rPr>
+        <w:t xml:space="preserve">Solution. </w:t>
+      </w:r>
+      <w:r>
+        <w:rPr>
+          <w:i w:val="0"/>
+        </w:rPr>
+        <w:t>Beam power = 10⁴ × 0.5 = 5 kW. Perveance = 0.5 / (10⁴)^1.5 = 0.5 × 10⁻⁶, or 0.5 µperv. With mc² = 511 keV, γ = 1.0196 and v = 0.195c = 5.85 × 10⁷ m/s. At 40% efficiency the RF output is 2 kW and 3 kW must be removed as heat, mostly in the collector.</w:t>
+      </w:r>
+    </w:p>
+    <w:p>
+      <w:pPr>
+        <w:pStyle w:val="Heading2"/>
+      </w:pPr>
+      <w:r>
+        <w:rPr>
+          <w:i w:val="0"/>
+        </w:rPr>
+        <w:t>13.2 Klystrons</w:t>
+      </w:r>
+    </w:p>
+    <w:p>
+      <w:pPr/>
+      <w:r>
+        <w:rPr>
+          <w:i w:val="0"/>
+        </w:rPr>
+        <w:t>In a klystron the RF input drives a resonant cavity whose gap speeds up some electrons and slows others. Downstream, the fast electrons catch up with the slow ones and the beam bunches; at an output cavity the bunched current induces a large RF voltage, delivering power. Intermediate cavities increase the bunching and the gain, which can exceed 40 dB. Klystrons are narrowband, because the cavities are resonant, but they reach very high power: multi-megawatt pulsed klystrons drive linear accelerators, and continuous-wave tubes of tens of kilowatts drive broadcast and industrial heating. The inductive output tube, a hybrid of a klystron and a triode, is common in UHF television transmitters.</w:t>
+      </w:r>
+    </w:p>
+    <w:p>
+      <w:pPr>
+        <w:pStyle w:val="Heading2"/>
+      </w:pPr>
+      <w:r>
+        <w:rPr>
+          <w:i w:val="0"/>
+        </w:rPr>
+        <w:t>13.3 Traveling-wave tubes</w:t>
+      </w:r>
+    </w:p>
+    <w:p>
+      <w:pPr/>
+      <w:r>
+        <w:rPr>
+          <w:i w:val="0"/>
+        </w:rPr>
+        <w:t>A traveling-wave tube slows an RF wave along a helix or a coupled-cavity structure until its phase velocity nearly matches the beam's. Over the length of the tube the wave and the beam exchange energy continuously, and the wave grows. Because the helix is not resonant, a TWT can amplify over an octave or more, with gains of 40 to 60 dB. Space TWTs add multistage depressed collectors that recover energy from the spent beam by slowing the electrons before they land, raising overall efficiency to 60% to 70%, more than a comparable solid-state amplifier at Ku and Ka band. That efficiency is why most high-power satellite transponders still use TWT amplifiers.</w:t>
+      </w:r>
+    </w:p>
+    <w:p>
+      <w:pPr>
+        <w:pStyle w:val="Heading2"/>
+      </w:pPr>
+      <w:r>
+        <w:rPr>
+          <w:i w:val="0"/>
+        </w:rPr>
+        <w:t>Worked Example 13.2</w:t>
+      </w:r>
+    </w:p>
+    <w:p>
+      <w:pPr/>
+      <w:r>
+        <w:rPr>
+          <w:b/>
+        </w:rPr>
+        <w:t xml:space="preserve">Problem. </w:t>
+      </w:r>
+      <w:r>
+        <w:rPr>
+          <w:i w:val="0"/>
+        </w:rPr>
+        <w:t>The 5 kW beam of Example 13.1 delivers 2 kW of RF. A depressed collector recovers 60% of the 3 kW remaining in the spent beam. Find the overall efficiency.</w:t>
+      </w:r>
+    </w:p>
+    <w:p>
+      <w:pPr/>
+      <w:r>
+        <w:rPr>
+          <w:b/>
+        </w:rPr>
+        <w:t xml:space="preserve">Solution. </w:t>
+      </w:r>
+      <w:r>
+        <w:rPr>
+          <w:i w:val="0"/>
+        </w:rPr>
+        <w:t>The supply now provides 5000 − 0.6 × 3000 = 3200 W net, because the recovered energy returns to the collector supply. The efficiency rises from 40% to 2000 / 3200 = 62.5%, and the heat to be removed falls from 3 kW to 1.2 kW.</w:t>
+      </w:r>
+    </w:p>
+    <w:p>
+      <w:pPr/>
+      <w:r>
+        <w:rPr>
+          <w:b/>
+        </w:rPr>
+        <w:t xml:space="preserve">Key idea. </w:t>
+      </w:r>
+      <w:r>
+        <w:rPr>
+          <w:i w:val="0"/>
+        </w:rPr>
+        <w:t>A vacuum tube converts the kinetic energy of an electron beam into RF, so its power is limited by the beam, not by a semiconductor's breakdown field and junction temperature. Depressed collectors recover much of the energy the RF did not take.</w:t>
+      </w:r>
+    </w:p>
+    <w:p>
+      <w:pPr>
+        <w:pStyle w:val="Heading2"/>
+      </w:pPr>
+      <w:r>
+        <w:rPr>
+          <w:i w:val="0"/>
+        </w:rPr>
+        <w:t>13.4 Magnetrons and gyrotrons</w:t>
+      </w:r>
+    </w:p>
+    <w:p>
+      <w:pPr/>
+      <w:r>
+        <w:rPr>
+          <w:i w:val="0"/>
+        </w:rPr>
+        <w:t>The magnetron is an oscillator rather than an amplifier: electrons spiral in crossed electric and magnetic fields past a ring of resonant cavities and give up energy to the oscillation. It is cheap and efficient, about 65% to 75% at 2.45 GHz, which is why a microwave oven delivers about a kilowatt from a component costing a few dollars. Its frequency and phase are not well controlled, which limits it to heating and older radars. The gyrotron uses electrons gyrating in a strong magnetic field to generate megawatts at frequencies of 100 GHz and above, where conventional structures would be too small, and it heats the plasma in fusion experiments.</w:t>
+      </w:r>
+    </w:p>
+    <w:p>
+      <w:pPr>
+        <w:pStyle w:val="Heading2"/>
+      </w:pPr>
+      <w:r>
+        <w:rPr>
+          <w:i w:val="0"/>
+        </w:rPr>
+        <w:t>Worked Example 13.3</w:t>
+      </w:r>
+    </w:p>
+    <w:p>
+      <w:pPr/>
+      <w:r>
+        <w:rPr>
+          <w:b/>
+        </w:rPr>
+        <w:t xml:space="preserve">Problem. </w:t>
+      </w:r>
+      <w:r>
+        <w:rPr>
+          <w:i w:val="0"/>
+        </w:rPr>
+        <w:t>A 250 W Ku-band satellite amplifier is built either as a TWT at 60% efficiency or as a solid-state amplifier at 40%. Find the DC power and the heat in each case.</w:t>
+      </w:r>
+    </w:p>
+    <w:p>
+      <w:pPr/>
+      <w:r>
+        <w:rPr>
+          <w:b/>
+        </w:rPr>
+        <w:t xml:space="preserve">Solution. </w:t>
+      </w:r>
+      <w:r>
+        <w:rPr>
+          <w:i w:val="0"/>
+        </w:rPr>
+        <w:t>TWT: 250 / 0.6 = 417 W from the bus, 167 W of heat. Solid state: 250 / 0.4 = 625 W, 375 W of heat. On a spacecraft, where every watt of solar array and radiator costs mass, the tube saves 208 W of DC power and more than halves the heat, outweighing its high-voltage supply and finite cathode life.</w:t>
+      </w:r>
+    </w:p>
+    <w:p>
+      <w:pPr>
+        <w:pStyle w:val="Heading2"/>
+      </w:pPr>
+      <w:r>
+        <w:rPr>
+          <w:i w:val="0"/>
+        </w:rPr>
+        <w:t>13.5 Tubes against solid state</w:t>
+      </w:r>
+    </w:p>
+    <w:p>
+      <w:pPr/>
+      <w:r>
+        <w:rPr>
+          <w:i w:val="0"/>
+        </w:rPr>
+        <w:t>Solid-state amplifiers win on lifetime, low voltage, graceful degradation, and cost at moderate power. Reaching 2 kW from 150 W GaN devices takes 16 of them and a combiner; with 0.5 dB of combining loss that yields about 2.14 kW, a large, complex assembly. Tubes win at the highest powers and frequencies, in high-efficiency space amplifiers, and in harsh radiation environments. The boundary keeps moving as GaN improves, but in 2026 it still lies around the kilowatt level at X band and above.</w:t>
+      </w:r>
+    </w:p>
+    <w:p>
+      <w:pPr>
+        <w:pStyle w:val="Heading2"/>
+      </w:pPr>
+      <w:r>
+        <w:rPr>
+          <w:i w:val="0"/>
+        </w:rPr>
+        <w:t>Practice</w:t>
+      </w:r>
+    </w:p>
+    <w:p>
+      <w:pPr/>
+      <w:r>
+        <w:rPr>
+          <w:b/>
+        </w:rPr>
+        <w:t xml:space="preserve">1. </w:t>
+      </w:r>
+      <w:r>
+        <w:rPr>
+          <w:i w:val="0"/>
+        </w:rPr>
+        <w:t>A tube runs at 20 kV and 2 A. Find the beam power and perveance.</w:t>
+      </w:r>
+    </w:p>
+    <w:p>
+      <w:pPr/>
+      <w:r>
+        <w:rPr>
+          <w:b/>
+        </w:rPr>
+        <w:t xml:space="preserve">2. </w:t>
+      </w:r>
+      <w:r>
+        <w:rPr>
+          <w:i w:val="0"/>
+        </w:rPr>
+        <w:t>Find the electron velocity, as a fraction of c, at 20 kV.</w:t>
+      </w:r>
+    </w:p>
+    <w:p>
+      <w:pPr/>
+      <w:r>
+        <w:rPr>
+          <w:b/>
+        </w:rPr>
+        <w:t xml:space="preserve">3. </w:t>
+      </w:r>
+      <w:r>
+        <w:rPr>
+          <w:i w:val="0"/>
+        </w:rPr>
+        <w:t>A magnetron delivers 1 kW at 70% efficiency. Find the DC input and the heat.</w:t>
+      </w:r>
+    </w:p>
+    <w:p>
+      <w:pPr/>
+      <w:r>
+        <w:rPr>
+          <w:b/>
+        </w:rPr>
+        <w:t xml:space="preserve">4. </w:t>
+      </w:r>
+      <w:r>
+        <w:rPr>
+          <w:i w:val="0"/>
+        </w:rPr>
+        <w:t>Why is a klystron narrowband while a helix TWT is broadband?</w:t>
+      </w:r>
+    </w:p>
+    <w:p>
+      <w:pPr/>
+      <w:r>
+        <w:rPr>
+          <w:b/>
+        </w:rPr>
+        <w:t xml:space="preserve">5. </w:t>
+      </w:r>
+      <w:r>
+        <w:rPr>
+          <w:i w:val="0"/>
+        </w:rPr>
+        <w:t>What does a depressed collector do?</w:t>
+      </w:r>
+    </w:p>
+    <w:p>
+      <w:pPr/>
+      <w:r>
+        <w:rPr>
+          <w:b/>
+        </w:rPr>
+        <w:t xml:space="preserve">6. </w:t>
+      </w:r>
+      <w:r>
+        <w:rPr>
+          <w:i w:val="0"/>
+        </w:rPr>
+        <w:t>Combining 16 amplifiers of 150 W with 0.5 dB of loss gives how much power?</w:t>
+      </w:r>
+    </w:p>
+    <w:p>
+      <w:pPr>
+        <w:pStyle w:val="Heading1"/>
+      </w:pPr>
+      <w:r>
+        <w:rPr>
+          <w:i w:val="0"/>
+        </w:rPr>
+        <w:t>Chapter 14. RF Exposure and Safety</w:t>
+      </w:r>
+    </w:p>
+    <w:p>
+      <w:pPr/>
+      <w:r>
+        <w:rPr>
+          <w:i w:val="0"/>
+        </w:rPr>
+        <w:t>A transmitter that radiates kilowatts of EIRP is also a source of radio-frequency energy absorbed by people nearby. At the frequencies in this book the established effect of that energy is heating, and exposure limits are set with large safety factors below the levels that cause measurable heating. Every licensed transmitter, base station, and phone must show compliance. This chapter explains the two quantities the limits use, power density and specific absorption rate, and how an engineer finds the distance at which an antenna becomes compliant.</w:t>
+      </w:r>
+    </w:p>
+    <w:p>
+      <w:pPr>
+        <w:pStyle w:val="Heading2"/>
+      </w:pPr>
+      <w:r>
+        <w:rPr>
+          <w:i w:val="0"/>
+        </w:rPr>
+        <w:t>14.1 The limits</w:t>
+      </w:r>
+    </w:p>
+    <w:p>
+      <w:pPr/>
+      <w:r>
+        <w:rPr>
+          <w:i w:val="0"/>
+        </w:rPr>
+        <w:t>Two bodies of rules dominate. In the United States the FCC limits of 47 CFR 1.1310, based on the IEEE and NCRP work of the 1980s and 1990s, set a maximum permissible exposure for the general public of 1 mW/cm², which is 10 W/m², from 1.5 to 100 GHz, and f/1500 mW/cm² between 300 and 1500 MHz, with f in megahertz. Occupational limits, for trained workers aware of the exposure, are five times higher. Internationally, the ICNIRP 2020 guidelines set 10 W/m² for the general public from 2 to 300 GHz, averaged over 30 minutes for whole-body exposure. Near the body, for phones and other devices held close, the limits are on the specific absorption rate: 1.6 W/kg averaged over 1 g of tissue under the FCC rules, and 2 W/kg over 10 g under ICNIRP.</w:t>
+      </w:r>
+    </w:p>
+    <w:p>
+      <w:pPr>
+        <w:jc w:val="center"/>
+      </w:pPr>
+      <w:r>
+        <w:rPr>
+          <w:i w:val="0"/>
+        </w:rPr>
+        <w:t>FCC general public: S ≤ f/1500 mW/cm² (300–1500 MHz);  1 mW/cm² = 10 W/m² (1.5–100 GHz)</w:t>
+      </w:r>
+    </w:p>
+    <w:p>
+      <w:pPr>
+        <w:pStyle w:val="Heading2"/>
+      </w:pPr>
+      <w:r>
+        <w:rPr>
+          <w:i w:val="0"/>
+        </w:rPr>
+        <w:t>14.2 Power density in the far field</w:t>
+      </w:r>
+    </w:p>
+    <w:p>
+      <w:pPr/>
+      <w:r>
+        <w:rPr>
+          <w:i w:val="0"/>
+        </w:rPr>
+        <w:t>Far from an antenna the power density is the EIRP spread over a sphere, S = EIRP/(4πR²). Solving for R gives the distance beyond which the exposure is below a limit. Near the ground, the direct and ground-reflected waves can add; FCC guidance in OET Bulletin 65 uses a reflection factor of 2.56 in power density, corresponding to a field 1.6 times the free-space value, for a conservative estimate. The far-field formula overestimates the density in the near field of a large aperture antenna, where the beam has not yet spread; there the density is bounded by roughly four times the power divided by the aperture area.</w:t>
+      </w:r>
+    </w:p>
+    <w:p>
+      <w:pPr>
+        <w:jc w:val="center"/>
+      </w:pPr>
+      <w:r>
+        <w:rPr>
+          <w:i w:val="0"/>
+        </w:rPr>
+        <w:t>S = EIRP/(4πR²),   Rcompliance = √(F × EIRP / (4π Slimit)),  F = 1 or 2.56</w:t>
+      </w:r>
+    </w:p>
+    <w:p>
+      <w:pPr>
+        <w:pStyle w:val="Heading2"/>
+      </w:pPr>
+      <w:r>
+        <w:rPr>
+          <w:i w:val="0"/>
+        </w:rPr>
+        <w:t>Worked Example 14.1</w:t>
+      </w:r>
+    </w:p>
+    <w:p>
+      <w:pPr/>
+      <w:r>
+        <w:rPr>
+          <w:b/>
+        </w:rPr>
+        <w:t xml:space="preserve">Problem. </w:t>
+      </w:r>
+      <w:r>
+        <w:rPr>
+          <w:i w:val="0"/>
+        </w:rPr>
+        <w:t>A sector antenna radiates an EIRP of 36 dBW (3981 W) at 3.5 GHz. Find the general-public compliance distance in the main beam, with and without the ground-reflection factor, and the occupational distance.</w:t>
+      </w:r>
+    </w:p>
+    <w:p>
+      <w:pPr/>
+      <w:r>
+        <w:rPr>
+          <w:b/>
+        </w:rPr>
+        <w:t xml:space="preserve">Solution. </w:t>
+      </w:r>
+      <w:r>
+        <w:rPr>
+          <w:i w:val="0"/>
+        </w:rPr>
+        <w:t>The limit at 3.5 GHz is 10 W/m². Without reflection, R = √(3981 / (4π × 10)) = 5.63 m. With the 2.56 factor, R = 5.63 × 1.6 = 9.0 m. For the occupational limit of 50 W/m², R = √(3981 / (4π × 50)) = 2.52 m. Because sector antennas are mounted high and the beam is narrow in elevation, people at ground level are usually far outside the main beam and well below the limit; the exclusion zone matters mostly to workers on the roof or tower.</w:t>
+      </w:r>
+    </w:p>
+    <w:p>
+      <w:pPr/>
+      <w:r>
+        <w:rPr>
+          <w:b/>
+        </w:rPr>
+        <w:t xml:space="preserve">Key idea. </w:t>
+      </w:r>
+      <w:r>
+        <w:rPr>
+          <w:i w:val="0"/>
+        </w:rPr>
+        <w:t>The power density from a transmitter falls as 1/R², so a compliance distance is the square root of the EIRP over 4π times the limit. Workers near the antenna, not the public on the ground, are the usual concern.</w:t>
+      </w:r>
+    </w:p>
+    <w:p>
+      <w:pPr>
+        <w:pStyle w:val="Heading2"/>
+      </w:pPr>
+      <w:r>
+        <w:rPr>
+          <w:i w:val="0"/>
+        </w:rPr>
+        <w:t>Worked Example 14.2</w:t>
+      </w:r>
+    </w:p>
+    <w:p>
+      <w:pPr/>
+      <w:r>
+        <w:rPr>
+          <w:b/>
+        </w:rPr>
+        <w:t xml:space="preserve">Problem. </w:t>
+      </w:r>
+      <w:r>
+        <w:rPr>
+          <w:i w:val="0"/>
+        </w:rPr>
+        <w:t>A 900 MHz transmitter has an EIRP of 100 W. Find the general-public limit and the compliance distance with the 2.56 factor.</w:t>
+      </w:r>
+    </w:p>
+    <w:p>
+      <w:pPr/>
+      <w:r>
+        <w:rPr>
+          <w:b/>
+        </w:rPr>
+        <w:t xml:space="preserve">Solution. </w:t>
+      </w:r>
+      <w:r>
+        <w:rPr>
+          <w:i w:val="0"/>
+        </w:rPr>
+        <w:t>The limit is 900/1500 = 0.6 mW/cm², 6 W/m². Without reflection R = √(100 / (4π × 6)) = 1.15 m; with the factor, 1.84 m.</w:t>
+      </w:r>
+    </w:p>
+    <w:p>
+      <w:pPr>
+        <w:pStyle w:val="Heading2"/>
+      </w:pPr>
+      <w:r>
+        <w:rPr>
+          <w:i w:val="0"/>
+        </w:rPr>
+        <w:t>14.3 Specific absorption rate</w:t>
+      </w:r>
+    </w:p>
+    <w:p>
+      <w:pPr/>
+      <w:r>
+        <w:rPr>
+          <w:i w:val="0"/>
+        </w:rPr>
+        <w:t>Close to the body, a device's field couples directly into tissue, and the far-field density is meaningless. SAR, the power absorbed per kilogram, is measured with a probe scanning inside a tissue-simulating liquid in a phantom of the head or body, while the device transmits at full power. The limit of 1.6 W/kg over 1 g is a heating rate: in tissue with a heat capacity near 3600 J/kg/K, it would raise the temperature by about 0.027 K per minute if no heat were carried away, and blood flow removes much of it. Phones meet the limit by antenna placement and by reducing power when sensors detect the head or body nearby. Above about 6 GHz, where energy is absorbed close to the skin surface, the newer rules switch from SAR to absorbed power density over a small area of skin.</w:t>
+      </w:r>
+    </w:p>
+    <w:p>
+      <w:pPr>
+        <w:pStyle w:val="Heading2"/>
+      </w:pPr>
+      <w:r>
+        <w:rPr>
+          <w:i w:val="0"/>
+        </w:rPr>
+        <w:t>14.4 Compliance in practice</w:t>
+      </w:r>
+    </w:p>
+    <w:p>
+      <w:pPr/>
+      <w:r>
+        <w:rPr>
+          <w:i w:val="0"/>
+        </w:rPr>
+        <w:t>For a new site, the engineer computes the exposure from every transmitter there, adds their contributions as fractions of their own limits, and checks that the sum stays below one in accessible areas. Where it does not, the site uses signs, barriers, and procedures, and workers power down or reduce the antennas before working in front of them. Measurement with broadband or frequency-selective probes confirms the calculation. Massive MIMO base stations, whose beams move, are assessed using the actual time-averaged power in each direction, which is usually well below the theoretical maximum.</w:t>
+      </w:r>
+    </w:p>
+    <w:p>
+      <w:pPr>
+        <w:pStyle w:val="Heading2"/>
+      </w:pPr>
+      <w:r>
+        <w:rPr>
+          <w:i w:val="0"/>
+        </w:rPr>
+        <w:t>Practice</w:t>
+      </w:r>
+    </w:p>
+    <w:p>
+      <w:pPr/>
+      <w:r>
+        <w:rPr>
+          <w:b/>
+        </w:rPr>
+        <w:t xml:space="preserve">1. </w:t>
+      </w:r>
+      <w:r>
+        <w:rPr>
+          <w:i w:val="0"/>
+        </w:rPr>
+        <w:t>Convert 1 mW/cm² to W/m².</w:t>
+      </w:r>
+    </w:p>
+    <w:p>
+      <w:pPr/>
+      <w:r>
+        <w:rPr>
+          <w:b/>
+        </w:rPr>
+        <w:t xml:space="preserve">2. </w:t>
+      </w:r>
+      <w:r>
+        <w:rPr>
+          <w:i w:val="0"/>
+        </w:rPr>
+        <w:t>Find the general-public limit at 600 MHz under the FCC rules.</w:t>
+      </w:r>
+    </w:p>
+    <w:p>
+      <w:pPr/>
+      <w:r>
+        <w:rPr>
+          <w:b/>
+        </w:rPr>
+        <w:t xml:space="preserve">3. </w:t>
+      </w:r>
+      <w:r>
+        <w:rPr>
+          <w:i w:val="0"/>
+        </w:rPr>
+        <w:t>An antenna radiates 50 W EIRP. Find the power density at 3 m.</w:t>
+      </w:r>
+    </w:p>
+    <w:p>
+      <w:pPr/>
+      <w:r>
+        <w:rPr>
+          <w:b/>
+        </w:rPr>
+        <w:t xml:space="preserve">4. </w:t>
+      </w:r>
+      <w:r>
+        <w:rPr>
+          <w:i w:val="0"/>
+        </w:rPr>
+        <w:t>Find the compliance distance for 1000 W EIRP at 28 GHz, without the reflection factor.</w:t>
+      </w:r>
+    </w:p>
+    <w:p>
+      <w:pPr/>
+      <w:r>
+        <w:rPr>
+          <w:b/>
+        </w:rPr>
+        <w:t xml:space="preserve">5. </w:t>
+      </w:r>
+      <w:r>
+        <w:rPr>
+          <w:i w:val="0"/>
+        </w:rPr>
+        <w:t>What electric field, in V/m, corresponds to a far-field power density of 10 W/m²?</w:t>
+      </w:r>
+    </w:p>
+    <w:p>
+      <w:pPr/>
+      <w:r>
+        <w:rPr>
+          <w:b/>
+        </w:rPr>
+        <w:t xml:space="preserve">6. </w:t>
+      </w:r>
+      <w:r>
+        <w:rPr>
+          <w:i w:val="0"/>
+        </w:rPr>
+        <w:t>Why is SAR used instead of power density for a phone held to the head?</w:t>
+      </w:r>
+    </w:p>
+    <w:p>
+      <w:pPr>
+        <w:pStyle w:val="Heading1"/>
+      </w:pPr>
+      <w:r>
+        <w:rPr>
+          <w:i w:val="0"/>
+        </w:rPr>
+        <w:t>Chapter 15. Transceiver Architectures and Isolation</w:t>
+      </w:r>
+    </w:p>
+    <w:p>
+      <w:pPr/>
+      <w:r>
+        <w:rPr>
+          <w:i w:val="0"/>
+        </w:rPr>
+        <w:t>A transceiver puts a transmitter that delivers watts next to a receiver that must detect signals near −100 dBm, often sharing one antenna. The ratio between them can exceed 120 dB, and keeping the transmitter from deafening its own receiver is a central problem of transceiver design. This chapter compares the ways of sharing the antenna, time division, frequency division, and full duplex, and works out the isolation each requires.</w:t>
+      </w:r>
+    </w:p>
+    <w:p>
+      <w:pPr>
+        <w:pStyle w:val="Heading2"/>
+      </w:pPr>
+      <w:r>
+        <w:rPr>
+          <w:i w:val="0"/>
+        </w:rPr>
+        <w:t>15.1 Time division and frequency division</w:t>
+      </w:r>
+    </w:p>
+    <w:p>
+      <w:pPr/>
+      <w:r>
+        <w:rPr>
+          <w:i w:val="0"/>
+        </w:rPr>
+        <w:t>In time-division duplex, TDD, the transmitter and receiver take turns on the same frequency, and a switch connects the antenna to one or the other. The receiver never has to listen while the transmitter is on, so the isolation required is modest, but the switch must change state quickly and guard times must separate the bursts. Wi-Fi, most 5G mid-band and millimeter-wave systems, and many radars use TDD. In frequency-division duplex, FDD, the transmitter and receiver work at the same time on different frequencies, separated by a duplex gap, and a duplexer of two filters, the subject of Chapter 5, separates them. FDD needs the duplexer to provide high isolation in two places: at the transmit frequency, to keep the carrier from overloading the receiver, and at the receive frequency, to keep the transmitter's noise out of the receive band.</w:t>
+      </w:r>
+    </w:p>
+    <w:p>
+      <w:pPr>
+        <w:pStyle w:val="Heading2"/>
+      </w:pPr>
+      <w:r>
+        <w:rPr>
+          <w:i w:val="0"/>
+        </w:rPr>
+        <w:t>15.2 Transmitter noise in the receive band</w:t>
+      </w:r>
+    </w:p>
+    <w:p>
+      <w:pPr/>
+      <w:r>
+        <w:rPr>
+          <w:i w:val="0"/>
+        </w:rPr>
+        <w:t>A power amplifier's output contains not only the carrier but broadband noise, and part of that noise falls in the receive band. The receiver cannot filter it, because it is at the wanted frequency, so the duplexer must attenuate it before it reaches the LNA. If the leaked noise equals the receiver's own noise floor, the floor rises by 3 dB, a 3 dB loss of sensitivity; designs usually keep the leak about 10 dB below the floor, which costs about half a decibel.</w:t>
+      </w:r>
+    </w:p>
+    <w:p>
+      <w:pPr>
+        <w:jc w:val="center"/>
+      </w:pPr>
+      <w:r>
+        <w:rPr>
+          <w:i w:val="0"/>
+        </w:rPr>
+        <w:t>Nfloor = −174 + NF dBm/Hz,   desense = 10 log10(1 + 10^((Nleak − Nfloor)/10))</w:t>
+      </w:r>
+    </w:p>
+    <w:p>
+      <w:pPr>
+        <w:pStyle w:val="Heading2"/>
+      </w:pPr>
+      <w:r>
+        <w:rPr>
+          <w:i w:val="0"/>
+        </w:rPr>
+        <w:t>Worked Example 15.1</w:t>
+      </w:r>
+    </w:p>
+    <w:p>
+      <w:pPr/>
+      <w:r>
+        <w:rPr>
+          <w:b/>
+        </w:rPr>
+        <w:t xml:space="preserve">Problem. </w:t>
+      </w:r>
+      <w:r>
+        <w:rPr>
+          <w:i w:val="0"/>
+        </w:rPr>
+        <w:t>An FDD receiver has a 3 dB noise figure. The transmitter's noise in the receive band is −135 dBm/Hz at the antenna port. What duplexer isolation at the receive frequency keeps the leak 9 dB below the receiver floor, and what is the desense?</w:t>
+      </w:r>
+    </w:p>
+    <w:p>
+      <w:pPr/>
+      <w:r>
+        <w:rPr>
+          <w:b/>
+        </w:rPr>
+        <w:t xml:space="preserve">Solution. </w:t>
+      </w:r>
+      <w:r>
+        <w:rPr>
+          <w:i w:val="0"/>
+        </w:rPr>
+        <w:t>The receiver floor is −174 + 3 = −171 dBm/Hz. The leak must be −180 dBm/Hz, so the isolation must be −135 − (−180) = 45 dB. The desense is 10 log10(1 + 10^(−0.9)) = 0.51 dB. With only 40 dB of isolation, the leak would be −175 dBm/Hz, 4 dB below the floor, and the desense would grow to 1.46 dB.</w:t>
+      </w:r>
+    </w:p>
+    <w:p>
+      <w:pPr/>
+      <w:r>
+        <w:rPr>
+          <w:b/>
+        </w:rPr>
+        <w:t xml:space="preserve">Key idea. </w:t>
+      </w:r>
+      <w:r>
+        <w:rPr>
+          <w:i w:val="0"/>
+        </w:rPr>
+        <w:t>In FDD, transmitter noise that lands in the receive band cannot be filtered at the receiver, so the duplexer's isolation at the receive frequency sets how much sensitivity the transmitter costs.</w:t>
+      </w:r>
+    </w:p>
+    <w:p>
+      <w:pPr>
+        <w:pStyle w:val="Heading2"/>
+      </w:pPr>
+      <w:r>
+        <w:rPr>
+          <w:i w:val="0"/>
+        </w:rPr>
+        <w:t>15.3 The transmit carrier as a blocker</w:t>
+      </w:r>
+    </w:p>
+    <w:p>
+      <w:pPr/>
+      <w:r>
+        <w:rPr>
+          <w:i w:val="0"/>
+        </w:rPr>
+        <w:t>The transmitter's carrier, attenuated by the duplexer's isolation at the transmit frequency, arrives at the LNA as a strong blocker just outside the receive band. It can compress the LNA, generate intermodulation with other signals, and, mixed with the oscillator's phase noise as in Chapter 6's reciprocal mixing, raise the noise floor. Its own modulation can also leak through second-order nonlinearity in a direct-conversion receiver, creating a baseband interferer. The receiver's linearity must be specified against this known blocker.</w:t>
+      </w:r>
+    </w:p>
+    <w:p>
+      <w:pPr>
+        <w:pStyle w:val="Heading2"/>
+      </w:pPr>
+      <w:r>
+        <w:rPr>
+          <w:i w:val="0"/>
+        </w:rPr>
+        <w:t>Worked Example 15.2</w:t>
+      </w:r>
+    </w:p>
+    <w:p>
+      <w:pPr/>
+      <w:r>
+        <w:rPr>
+          <w:b/>
+        </w:rPr>
+        <w:t xml:space="preserve">Problem. </w:t>
+      </w:r>
+      <w:r>
+        <w:rPr>
+          <w:i w:val="0"/>
+        </w:rPr>
+        <w:t>A handset transmits 25 dBm. The duplexer provides 50 dB of isolation at the transmit frequency. What carrier power reaches the LNA, and what does that imply?</w:t>
+      </w:r>
+    </w:p>
+    <w:p>
+      <w:pPr/>
+      <w:r>
+        <w:rPr>
+          <w:b/>
+        </w:rPr>
+        <w:t xml:space="preserve">Solution. </w:t>
+      </w:r>
+      <w:r>
+        <w:rPr>
+          <w:i w:val="0"/>
+        </w:rPr>
+        <w:t>25 − 50 = −25 dBm at the LNA input. The LNA's input compression point must be well above −25 dBm, typically by 10 dB or more, and its IIP3 must keep intermodulation between this carrier and other blockers below the noise floor. A receiver that was designed for weak signals alone would be overloaded by its own transmitter.</w:t>
+      </w:r>
+    </w:p>
+    <w:p>
+      <w:pPr>
+        <w:pStyle w:val="Heading2"/>
+      </w:pPr>
+      <w:r>
+        <w:rPr>
+          <w:i w:val="0"/>
+        </w:rPr>
+        <w:t>15.4 Full duplex on one frequency</w:t>
+      </w:r>
+    </w:p>
+    <w:p>
+      <w:pPr/>
+      <w:r>
+        <w:rPr>
+          <w:i w:val="0"/>
+        </w:rPr>
+        <w:t>Transmitting and receiving at once on the same frequency, full duplex, would double spectral efficiency, but the receiver must then remove its own transmitted signal almost completely. The cancellation is done in stages: antenna separation or a circulator gives a few tens of decibels, an analog canceller that subtracts a tapped copy of the transmit signal gives more, and a digital canceller that models the residual channel and nonlinearities removes the rest. Each stage must track changes in the antenna and environment. Full duplex is used today in some cable systems and in-band relays, and it remains a research topic for cellular radios.</w:t>
+      </w:r>
+    </w:p>
+    <w:p>
+      <w:pPr>
+        <w:pStyle w:val="Heading2"/>
+      </w:pPr>
+      <w:r>
+        <w:rPr>
+          <w:i w:val="0"/>
+        </w:rPr>
+        <w:t>Worked Example 15.3</w:t>
+      </w:r>
+    </w:p>
+    <w:p>
+      <w:pPr/>
+      <w:r>
+        <w:rPr>
+          <w:b/>
+        </w:rPr>
+        <w:t xml:space="preserve">Problem. </w:t>
+      </w:r>
+      <w:r>
+        <w:rPr>
+          <w:i w:val="0"/>
+        </w:rPr>
+        <w:t>A full-duplex radio transmits 25 dBm and receives in a 20 MHz channel with a 5 dB noise figure. How much self-interference cancellation brings its own signal down to the noise floor?</w:t>
+      </w:r>
+    </w:p>
+    <w:p>
+      <w:pPr/>
+      <w:r>
+        <w:rPr>
+          <w:b/>
+        </w:rPr>
+        <w:t xml:space="preserve">Solution. </w:t>
+      </w:r>
+      <w:r>
+        <w:rPr>
+          <w:i w:val="0"/>
+        </w:rPr>
+        <w:t>The noise floor is −174 + 10 log10(2 × 10⁷) + 5 = −96 dBm. The cancellation must be 25 − (−96) = 121 dB, all in the same band as the wanted signal, which is why it must combine passive isolation, analog cancellation, and digital cancellation, each contributing a few tens of decibels.</w:t>
+      </w:r>
+    </w:p>
+    <w:p>
+      <w:pPr>
+        <w:pStyle w:val="Heading2"/>
+      </w:pPr>
+      <w:r>
+        <w:rPr>
+          <w:i w:val="0"/>
+        </w:rPr>
+        <w:t>Practice</w:t>
+      </w:r>
+    </w:p>
+    <w:p>
+      <w:pPr/>
+      <w:r>
+        <w:rPr>
+          <w:b/>
+        </w:rPr>
+        <w:t xml:space="preserve">1. </w:t>
+      </w:r>
+      <w:r>
+        <w:rPr>
+          <w:i w:val="0"/>
+        </w:rPr>
+        <w:t>Find the receiver noise floor in dBm/Hz for a 4 dB noise figure.</w:t>
+      </w:r>
+    </w:p>
+    <w:p>
+      <w:pPr/>
+      <w:r>
+        <w:rPr>
+          <w:b/>
+        </w:rPr>
+        <w:t xml:space="preserve">2. </w:t>
+      </w:r>
+      <w:r>
+        <w:rPr>
+          <w:i w:val="0"/>
+        </w:rPr>
+        <w:t>A transmitter's noise leak is 6 dB below the receiver floor. Find the desense.</w:t>
+      </w:r>
+    </w:p>
+    <w:p>
+      <w:pPr/>
+      <w:r>
+        <w:rPr>
+          <w:b/>
+        </w:rPr>
+        <w:t xml:space="preserve">3. </w:t>
+      </w:r>
+      <w:r>
+        <w:rPr>
+          <w:i w:val="0"/>
+        </w:rPr>
+        <w:t>A transmitter at 23 dBm, 10 MHz channel, receiver noise figure 4 dB. How much cancellation does full duplex need?</w:t>
+      </w:r>
+    </w:p>
+    <w:p>
+      <w:pPr/>
+      <w:r>
+        <w:rPr>
+          <w:b/>
+        </w:rPr>
+        <w:t xml:space="preserve">4. </w:t>
+      </w:r>
+      <w:r>
+        <w:rPr>
+          <w:i w:val="0"/>
+        </w:rPr>
+        <w:t>The duplexer gives 55 dB of transmit-band isolation. What blocker reaches the LNA from a 28 dBm transmitter?</w:t>
+      </w:r>
+    </w:p>
+    <w:p>
+      <w:pPr/>
+      <w:r>
+        <w:rPr>
+          <w:b/>
+        </w:rPr>
+        <w:t xml:space="preserve">5. </w:t>
+      </w:r>
+      <w:r>
+        <w:rPr>
+          <w:i w:val="0"/>
+        </w:rPr>
+        <w:t>Why does TDD need less duplexer isolation than FDD?</w:t>
+      </w:r>
+    </w:p>
+    <w:p>
+      <w:pPr/>
+      <w:r>
+        <w:rPr>
+          <w:b/>
+        </w:rPr>
+        <w:t xml:space="preserve">6. </w:t>
+      </w:r>
+      <w:r>
+        <w:rPr>
+          <w:i w:val="0"/>
+        </w:rPr>
+        <w:t>Why can't the receiver simply filter the transmitter's noise in the receive band?</w:t>
+      </w:r>
+    </w:p>
+    <w:p>
+      <w:pPr>
+        <w:pStyle w:val="Heading1"/>
+      </w:pPr>
+      <w:r>
+        <w:rPr>
+          <w:i w:val="0"/>
+        </w:rPr>
+        <w:t>Chapter 16. Designing Class E and Class F Amplifiers</w:t>
+      </w:r>
+    </w:p>
+    <w:p>
+      <w:pPr/>
+      <w:r>
+        <w:rPr>
+          <w:i w:val="0"/>
+        </w:rPr>
+        <w:t>Chapter 3 introduced the switching and harmonic-tuned classes as ideas. This chapter designs them. Both aim at the same thing, a drain voltage and current that never overlap, so that the device dissipates almost nothing, but they reach it differently. Class E shapes the voltage with a shunt capacitor and a tuned load so that the switch closes at zero voltage and zero slope. Class F shapes it with harmonic terminations so that the voltage is nearly square and the current nearly a half sine. The design equations below are the standard ones from Sokal's and Raab's work.</w:t>
+      </w:r>
+    </w:p>
+    <w:p>
+      <w:pPr>
+        <w:pStyle w:val="Heading2"/>
+      </w:pPr>
+      <w:r>
+        <w:rPr>
+          <w:i w:val="0"/>
+        </w:rPr>
+        <w:t>16.1 The class E conditions</w:t>
+      </w:r>
+    </w:p>
+    <w:p>
+      <w:pPr/>
+      <w:r>
+        <w:rPr>
+          <w:i w:val="0"/>
+        </w:rPr>
+        <w:t>In class E the transistor acts as a switch, on for half of each cycle. A capacitor across the switch, which may be partly or wholly the device's own output capacitance, charges while the switch is off, and a series resonant load with some excess inductance shapes the voltage so that it returns to zero, with zero slope, just as the switch closes. No energy stored in the capacitor is dumped into the switch, which is the loss that ruins a hard-switched amplifier at high frequency. For a 50% duty cycle and an ideal switch, the design equations fix the load resistance, the shunt capacitance, and the excess reactance in terms of the supply and the output power.</w:t>
+      </w:r>
+    </w:p>
+    <w:p>
+      <w:pPr>
+        <w:jc w:val="center"/>
+      </w:pPr>
+      <w:r>
+        <w:rPr>
+          <w:i w:val="0"/>
+        </w:rPr>
+        <w:t>R = 0.5768 VDD²/P,   C = 0.1836/(ωR),   Xexcess = 1.1525 R,   vpk = 3.562 VDD,   ipk = 2.862 IDC</w:t>
+      </w:r>
+    </w:p>
+    <w:p>
+      <w:pPr>
+        <w:pStyle w:val="Heading2"/>
+      </w:pPr>
+      <w:r>
+        <w:rPr>
+          <w:i w:val="0"/>
+        </w:rPr>
+        <w:t>Worked Example 16.1</w:t>
+      </w:r>
+    </w:p>
+    <w:p>
+      <w:pPr/>
+      <w:r>
+        <w:rPr>
+          <w:b/>
+        </w:rPr>
+        <w:t xml:space="preserve">Problem. </w:t>
+      </w:r>
+      <w:r>
+        <w:rPr>
+          <w:i w:val="0"/>
+        </w:rPr>
+        <w:t>Design a class E stage for 100 W at 900 MHz from a 28 V supply. Find the load resistance, the shunt capacitance, the excess reactance, the peak switch voltage, and the peak current.</w:t>
+      </w:r>
+    </w:p>
+    <w:p>
+      <w:pPr/>
+      <w:r>
+        <w:rPr>
+          <w:b/>
+        </w:rPr>
+        <w:t xml:space="preserve">Solution. </w:t>
+      </w:r>
+      <w:r>
+        <w:rPr>
+          <w:i w:val="0"/>
+        </w:rPr>
+        <w:t>R = 0.5768 × 28² / 100 = 4.52 Ω. C = 0.1836 / (2π × 9 × 10⁸ × 4.52) = 7.18 pF. The excess reactance is 1.1525 × 4.52 = 5.21 Ω, an inductance of 0.92 nH at 900 MHz. The DC current is 100 / 28 = 3.57 A, so the peak current is 2.862 × 3.57 = 10.2 A, and the peak voltage is 3.562 × 28 = 99.7 V. The device must withstand about 100 V, which is why class E at this power suits GaN with its high breakdown voltage.</w:t>
+      </w:r>
+    </w:p>
+    <w:p>
+      <w:pPr/>
+      <w:r>
+        <w:rPr>
+          <w:b/>
+        </w:rPr>
+        <w:t xml:space="preserve">Key idea. </w:t>
+      </w:r>
+      <w:r>
+        <w:rPr>
+          <w:i w:val="0"/>
+        </w:rPr>
+        <w:t>Class E avoids switching loss by arranging for the switch voltage to fall to zero, with zero slope, at the instant the switch closes. The price is a peak voltage about 3.6 times the supply.</w:t>
+      </w:r>
+    </w:p>
+    <w:p>
+      <w:pPr>
+        <w:pStyle w:val="Heading2"/>
+      </w:pPr>
+      <w:r>
+        <w:rPr>
+          <w:i w:val="0"/>
+        </w:rPr>
+        <w:t>16.2 The frequency limit</w:t>
+      </w:r>
+    </w:p>
+    <w:p>
+      <w:pPr/>
+      <w:r>
+        <w:rPr>
+          <w:i w:val="0"/>
+        </w:rPr>
+        <w:t>The shunt capacitance in Example 16.1 must be at least the device's own output capacitance, because that capacitance is always there. The maximum frequency at which class E works at full power is therefore the one where the required C equals Cout. Above it, the design must reduce power, use a smaller device, or move to a different class. The power output capability, P/(vpk ipk), is 0.098 for class E against 0.125 for class B, so for the same device stresses class E delivers a little less power.</w:t>
+      </w:r>
+    </w:p>
+    <w:p>
+      <w:pPr>
+        <w:jc w:val="center"/>
+      </w:pPr>
+      <w:r>
+        <w:rPr>
+          <w:i w:val="0"/>
+        </w:rPr>
+        <w:t>fmax = 0.1836/(2π R Cout),   cp = P/(vpk ipk) = 0.0981</w:t>
+      </w:r>
+    </w:p>
+    <w:p>
+      <w:pPr>
+        <w:pStyle w:val="Heading2"/>
+      </w:pPr>
+      <w:r>
+        <w:rPr>
+          <w:i w:val="0"/>
+        </w:rPr>
+        <w:t>Worked Example 16.2</w:t>
+      </w:r>
+    </w:p>
+    <w:p>
+      <w:pPr/>
+      <w:r>
+        <w:rPr>
+          <w:b/>
+        </w:rPr>
+        <w:t xml:space="preserve">Problem. </w:t>
+      </w:r>
+      <w:r>
+        <w:rPr>
+          <w:i w:val="0"/>
+        </w:rPr>
+        <w:t>The device in Example 16.1 has an output capacitance of 10 pF. What is the highest frequency for the design?</w:t>
+      </w:r>
+    </w:p>
+    <w:p>
+      <w:pPr/>
+      <w:r>
+        <w:rPr>
+          <w:b/>
+        </w:rPr>
+        <w:t xml:space="preserve">Solution. </w:t>
+      </w:r>
+      <w:r>
+        <w:rPr>
+          <w:i w:val="0"/>
+        </w:rPr>
+        <w:t>fmax = 0.1836 / (2π × 4.52 × 10⁻¹¹) = 646 MHz. At 900 MHz the 10 pF device has more capacitance than the design allows, so the designer must accept less than 100 W, use a smaller device with less capacitance, or move to a class E variant or a different class.</w:t>
+      </w:r>
+    </w:p>
+    <w:p>
+      <w:pPr>
+        <w:pStyle w:val="Heading2"/>
+      </w:pPr>
+      <w:r>
+        <w:rPr>
+          <w:i w:val="0"/>
+        </w:rPr>
+        <w:t>16.3 Class F and its inverse</w:t>
+      </w:r>
+    </w:p>
+    <w:p>
+      <w:pPr/>
+      <w:r>
+        <w:rPr>
+          <w:i w:val="0"/>
+        </w:rPr>
+        <w:t>Class F leaves the device acting as a current source, as in class B, but presents short circuits at the even harmonics and open circuits at the odd ones. The current then contains the fundamental and even harmonics, approaching a half sine; the voltage contains the fundamental and odd harmonics, approaching a square wave. Neither waveform needs to be perfect: each added harmonic raises the efficiency. Inverse class F swaps the roles, a square current and a half-sine voltage, and suits devices whose voltage swing is limited by the knee. In practice, controlling the second and third harmonics captures most of the benefit.</w:t>
+      </w:r>
+    </w:p>
+    <w:p>
+      <w:pPr>
+        <w:jc w:val="center"/>
+      </w:pPr>
+      <w:r>
+        <w:rPr>
+          <w:i w:val="0"/>
+        </w:rPr>
+        <w:t>η = ½ (V1/VDD)(I1/IDC)</w:t>
+      </w:r>
+    </w:p>
+    <w:p>
+      <w:pPr>
+        <w:pStyle w:val="Heading2"/>
+      </w:pPr>
+      <w:r>
+        <w:rPr>
+          <w:i w:val="0"/>
+        </w:rPr>
+        <w:t>Worked Example 16.3</w:t>
+      </w:r>
+    </w:p>
+    <w:p>
+      <w:pPr/>
+      <w:r>
+        <w:rPr>
+          <w:b/>
+        </w:rPr>
+        <w:t xml:space="preserve">Problem. </w:t>
+      </w:r>
+      <w:r>
+        <w:rPr>
+          <w:i w:val="0"/>
+        </w:rPr>
+        <w:t>Find the maximum drain efficiency of an ideal class F amplifier whose voltage contains the fundamental and the third harmonic and whose current contains the fundamental and the second harmonic. Compare with half-sine current.</w:t>
+      </w:r>
+    </w:p>
+    <w:p>
+      <w:pPr/>
+      <w:r>
+        <w:rPr>
+          <w:b/>
+        </w:rPr>
+        <w:t xml:space="preserve">Solution. </w:t>
+      </w:r>
+      <w:r>
+        <w:rPr>
+          <w:i w:val="0"/>
+        </w:rPr>
+        <w:t>With a third harmonic, the largest fundamental voltage that keeps the waveform non-negative is V1/VDD = 2/√3 = 1.155. With a second harmonic, the largest fundamental current is I1/IDC = √2 = 1.414. The efficiency is ½ × 1.155 × 1.414 = 81.6%. With the full half-sine current, I1/IDC = π/2, it rises to ½ × 1.155 × 1.571 = 90.7%. For comparison, class B, with no voltage harmonics, gives π/4 = 78.5%, and controlling only the second harmonic of the current with a sinusoidal voltage gives 70.7%.</w:t>
+      </w:r>
+    </w:p>
+    <w:p>
+      <w:pPr>
+        <w:pStyle w:val="Heading2"/>
+      </w:pPr>
+      <w:r>
+        <w:rPr>
+          <w:i w:val="0"/>
+        </w:rPr>
+        <w:t>16.4 Practical harmonic terminations</w:t>
+      </w:r>
+    </w:p>
+    <w:p>
+      <w:pPr/>
+      <w:r>
+        <w:rPr>
+          <w:i w:val="0"/>
+        </w:rPr>
+        <w:t>Real terminations are made with transmission-line stubs or lumped resonators placed at the device's internal current source, which means compensating for its output capacitance and package parasitics. At microwave frequencies only the first two or three harmonics can be controlled, and the device's capacitance shorts the higher ones anyway, which partly helps. Load-pull measurements at the fundamental and harmonics show how sensitive the efficiency is to each termination. Continuous class F and continuous class B/J modes relax the terminations so that high efficiency holds over a band, not only at one frequency.</w:t>
+      </w:r>
+    </w:p>
+    <w:p>
+      <w:pPr>
+        <w:pStyle w:val="Heading2"/>
+      </w:pPr>
+      <w:r>
+        <w:rPr>
+          <w:i w:val="0"/>
+        </w:rPr>
+        <w:t>Practice</w:t>
+      </w:r>
+    </w:p>
+    <w:p>
+      <w:pPr/>
+      <w:r>
+        <w:rPr>
+          <w:b/>
+        </w:rPr>
+        <w:t xml:space="preserve">1. </w:t>
+      </w:r>
+      <w:r>
+        <w:rPr>
+          <w:i w:val="0"/>
+        </w:rPr>
+        <w:t>Design a class E stage for 10 W from a 12 V supply at 13.56 MHz. Find R and C.</w:t>
+      </w:r>
+    </w:p>
+    <w:p>
+      <w:pPr/>
+      <w:r>
+        <w:rPr>
+          <w:b/>
+        </w:rPr>
+        <w:t xml:space="preserve">2. </w:t>
+      </w:r>
+      <w:r>
+        <w:rPr>
+          <w:i w:val="0"/>
+        </w:rPr>
+        <w:t>What peak voltage must the switch in the previous problem withstand?</w:t>
+      </w:r>
+    </w:p>
+    <w:p>
+      <w:pPr/>
+      <w:r>
+        <w:rPr>
+          <w:b/>
+        </w:rPr>
+        <w:t xml:space="preserve">3. </w:t>
+      </w:r>
+      <w:r>
+        <w:rPr>
+          <w:i w:val="0"/>
+        </w:rPr>
+        <w:t>Find the maximum frequency for a 4.52 Ω class E design if Cout = 5 pF.</w:t>
+      </w:r>
+    </w:p>
+    <w:p>
+      <w:pPr/>
+      <w:r>
+        <w:rPr>
+          <w:b/>
+        </w:rPr>
+        <w:t xml:space="preserve">4. </w:t>
+      </w:r>
+      <w:r>
+        <w:rPr>
+          <w:i w:val="0"/>
+        </w:rPr>
+        <w:t>What is the efficiency of a class F amplifier with half-sine current and voltage limited to the fundamental?</w:t>
+      </w:r>
+    </w:p>
+    <w:p>
+      <w:pPr/>
+      <w:r>
+        <w:rPr>
+          <w:b/>
+        </w:rPr>
+        <w:t xml:space="preserve">5. </w:t>
+      </w:r>
+      <w:r>
+        <w:rPr>
+          <w:i w:val="0"/>
+        </w:rPr>
+        <w:t>Why does class E suit GaN devices?</w:t>
+      </w:r>
+    </w:p>
+    <w:p>
+      <w:pPr/>
+      <w:r>
+        <w:rPr>
+          <w:b/>
+        </w:rPr>
+        <w:t xml:space="preserve">6. </w:t>
+      </w:r>
+      <w:r>
+        <w:rPr>
+          <w:i w:val="0"/>
+        </w:rPr>
+        <w:t>Why does controlling a few harmonics capture most of class F's benefit?</w:t>
+      </w:r>
+    </w:p>
+    <w:p>
+      <w:pPr>
+        <w:pStyle w:val="Heading1"/>
+      </w:pPr>
+      <w:r>
+        <w:rPr>
+          <w:i w:val="0"/>
+        </w:rPr>
+        <w:t>Chapter 17. Envelope Tracking, Polar, and Outphasing</w:t>
+      </w:r>
+    </w:p>
+    <w:p>
+      <w:pPr/>
+      <w:r>
+        <w:rPr>
+          <w:i w:val="0"/>
+        </w:rPr>
+        <w:t>Chapter 4 showed that an amplifier with a fixed supply wastes most of its power when the signal's average sits well below its peak, and that the Doherty amplifier recovers some of that efficiency. This chapter takes up the other families of efficiency enhancement. Envelope tracking and polar transmitters change the supply voltage with the signal's envelope. Outphasing transmitters keep each amplifier saturated and create amplitude by combining two constant-envelope signals at varying phase. Each trades efficiency against bandwidth, linearity, and complexity.</w:t>
+      </w:r>
+    </w:p>
+    <w:p>
+      <w:pPr>
+        <w:pStyle w:val="Heading2"/>
+      </w:pPr>
+      <w:r>
+        <w:rPr>
+          <w:i w:val="0"/>
+        </w:rPr>
+        <w:t>17.1 Why back-off is expensive</w:t>
+      </w:r>
+    </w:p>
+    <w:p>
+      <w:pPr/>
+      <w:r>
+        <w:rPr>
+          <w:i w:val="0"/>
+        </w:rPr>
+        <w:t>An OFDM signal of Book 5 has a peak-to-average power ratio, PAPR, of 8 to 10 dB even after crest-factor reduction. An amplifier must handle the peak, so on average it runs 8 to 10 dB below its saturated power. A class B stage's efficiency falls with the square root of the output power, so at 8 dB back-off its ideal efficiency is 78.5% × 10^(−8/20) = 31%. Most of the supply power is heat.</w:t>
+      </w:r>
+    </w:p>
+    <w:p>
+      <w:pPr>
+        <w:pStyle w:val="Heading2"/>
+      </w:pPr>
+      <w:r>
+        <w:rPr>
+          <w:i w:val="0"/>
+        </w:rPr>
+        <w:t>17.2 Envelope tracking</w:t>
+      </w:r>
+    </w:p>
+    <w:p>
+      <w:pPr/>
+      <w:r>
+        <w:rPr>
+          <w:i w:val="0"/>
+        </w:rPr>
+        <w:t>An envelope-tracking transmitter drives the amplifier's supply from a fast modulator that follows the signal envelope, keeping the amplifier near compression at every instant. The amplifier still receives the full RF signal, amplitude and phase, so it remains a linear amplifier, but its supply voltage, and therefore its dissipation, falls with the envelope. The overall efficiency is the product of the amplifier's efficiency near compression and the modulator's efficiency. The modulator is the hard part: it must deliver watts with high efficiency and a bandwidth several times the signal's, because the envelope is a nonlinear function of the I and Q signals and is broader than either.</w:t>
+      </w:r>
+    </w:p>
+    <w:p>
+      <w:pPr>
+        <w:jc w:val="center"/>
+      </w:pPr>
+      <w:r>
+        <w:rPr>
+          <w:i w:val="0"/>
+        </w:rPr>
+        <w:t>ηtotal = ηPA × ηmodulator,   Benvelope ≈ 3 to 5 × Bsignal</w:t>
+      </w:r>
+    </w:p>
+    <w:p>
+      <w:pPr>
+        <w:pStyle w:val="Heading2"/>
+      </w:pPr>
+      <w:r>
+        <w:rPr>
+          <w:i w:val="0"/>
+        </w:rPr>
+        <w:t>Worked Example 17.1</w:t>
+      </w:r>
+    </w:p>
+    <w:p>
+      <w:pPr/>
+      <w:r>
+        <w:rPr>
+          <w:b/>
+        </w:rPr>
+        <w:t xml:space="preserve">Problem. </w:t>
+      </w:r>
+      <w:r>
+        <w:rPr>
+          <w:i w:val="0"/>
+        </w:rPr>
+        <w:t>A transmitter delivers 10 W average with an 8 dB PAPR. A fixed-supply class B stage achieves its ideal back-off efficiency; an envelope-tracking design holds the amplifier at 65% with an 85% modulator. Compare the supply power.</w:t>
+      </w:r>
+    </w:p>
+    <w:p>
+      <w:pPr/>
+      <w:r>
+        <w:rPr>
+          <w:b/>
+        </w:rPr>
+        <w:t xml:space="preserve">Solution. </w:t>
+      </w:r>
+      <w:r>
+        <w:rPr>
+          <w:i w:val="0"/>
+        </w:rPr>
+        <w:t>Fixed supply: 31.25% efficiency, so 10 / 0.3125 = 32.0 W of supply power and 22 W of heat. Envelope tracking: 0.65 × 0.85 = 55.3%, so 10 / 0.5525 = 18.1 W and 8.1 W of heat. The envelope tracker cuts the supply power by 43% and the heat by almost two-thirds.</w:t>
+      </w:r>
+    </w:p>
+    <w:p>
+      <w:pPr/>
+      <w:r>
+        <w:rPr>
+          <w:b/>
+        </w:rPr>
+        <w:t xml:space="preserve">Key idea. </w:t>
+      </w:r>
+      <w:r>
+        <w:rPr>
+          <w:i w:val="0"/>
+        </w:rPr>
+        <w:t>Envelope tracking keeps the amplifier near compression by lowering its supply when the signal is small. Its gain depends on a supply modulator that is both efficient and several times wider in bandwidth than the signal.</w:t>
+      </w:r>
+    </w:p>
+    <w:p>
+      <w:pPr>
+        <w:pStyle w:val="Heading2"/>
+      </w:pPr>
+      <w:r>
+        <w:rPr>
+          <w:i w:val="0"/>
+        </w:rPr>
+        <w:t>17.3 Polar transmitters and EER</w:t>
+      </w:r>
+    </w:p>
+    <w:p>
+      <w:pPr/>
+      <w:r>
+        <w:rPr>
+          <w:i w:val="0"/>
+        </w:rPr>
+        <w:t>Kahn's envelope elimination and restoration, and the modern polar transmitter, go further. The phase is applied to a constant-envelope RF signal that drives a switching amplifier, class E or D, into saturation, and the amplitude is restored by modulating its supply. The amplifier can then be as efficient as Chapter 16's designs, but the amplitude and phase paths must be aligned in time to a small fraction of the symbol period, and the amplitude path must reach down to zero without distortion. Polar transmitters work well for narrowband signals; for 100 MHz OFDM, the envelope bandwidth of several hundred megahertz is beyond an efficient supply modulator.</w:t>
+      </w:r>
+    </w:p>
+    <w:p>
+      <w:pPr>
+        <w:pStyle w:val="Heading2"/>
+      </w:pPr>
+      <w:r>
+        <w:rPr>
+          <w:i w:val="0"/>
+        </w:rPr>
+        <w:t>Worked Example 17.2</w:t>
+      </w:r>
+    </w:p>
+    <w:p>
+      <w:pPr/>
+      <w:r>
+        <w:rPr>
+          <w:b/>
+        </w:rPr>
+        <w:t xml:space="preserve">Problem. </w:t>
+      </w:r>
+      <w:r>
+        <w:rPr>
+          <w:i w:val="0"/>
+        </w:rPr>
+        <w:t>A 100 MHz 5G carrier is to be envelope-tracked. Estimate the bandwidth the supply modulator needs.</w:t>
+      </w:r>
+    </w:p>
+    <w:p>
+      <w:pPr/>
+      <w:r>
+        <w:rPr>
+          <w:b/>
+        </w:rPr>
+        <w:t xml:space="preserve">Solution. </w:t>
+      </w:r>
+      <w:r>
+        <w:rPr>
+          <w:i w:val="0"/>
+        </w:rPr>
+        <w:t>With the rule of thumb of three to five times the signal bandwidth, the modulator needs 300 to 500 MHz. Efficient switching supplies reach tens of megahertz, so wideband trackers combine a fast linear amplifier with a slower switcher; the linear part's lower efficiency pulls ηmodulator down. This is why handset envelope trackers are common for LTE and 5G channels up to about 100 MHz but are hard to extend to wider channels.</w:t>
+      </w:r>
+    </w:p>
+    <w:p>
+      <w:pPr>
+        <w:pStyle w:val="Heading2"/>
+      </w:pPr>
+      <w:r>
+        <w:rPr>
+          <w:i w:val="0"/>
+        </w:rPr>
+        <w:t>17.4 Outphasing</w:t>
+      </w:r>
+    </w:p>
+    <w:p>
+      <w:pPr/>
+      <w:r>
+        <w:rPr>
+          <w:i w:val="0"/>
+        </w:rPr>
+        <w:t>Chireix's outphasing transmitter splits the signal into two constant-envelope components whose phases are offset by ±φ. Each drives a saturated, efficient amplifier, and a combiner adds them; the sum's amplitude is proportional to cos φ, so the output power is Pmax cos²φ. A simple isolating combiner wastes the difference power in its load, so efficient outphasing uses a non-isolating Chireix combiner with compensating reactances, which lets each amplifier see a load that changes with φ. The efficiency then peaks at full power and at a chosen back-off, much as in a Doherty amplifier.</w:t>
+      </w:r>
+    </w:p>
+    <w:p>
+      <w:pPr>
+        <w:jc w:val="center"/>
+      </w:pPr>
+      <w:r>
+        <w:rPr>
+          <w:i w:val="0"/>
+        </w:rPr>
+        <w:t>Pout = Pmax cos² φ,   back-off (dB) = −20 log10 cos φ</w:t>
+      </w:r>
+    </w:p>
+    <w:p>
+      <w:pPr>
+        <w:pStyle w:val="Heading2"/>
+      </w:pPr>
+      <w:r>
+        <w:rPr>
+          <w:i w:val="0"/>
+        </w:rPr>
+        <w:t>Worked Example 17.3</w:t>
+      </w:r>
+    </w:p>
+    <w:p>
+      <w:pPr/>
+      <w:r>
+        <w:rPr>
+          <w:b/>
+        </w:rPr>
+        <w:t xml:space="preserve">Problem. </w:t>
+      </w:r>
+      <w:r>
+        <w:rPr>
+          <w:i w:val="0"/>
+        </w:rPr>
+        <w:t>Find the outphasing angle for 3, 6, and 10 dB of back-off.</w:t>
+      </w:r>
+    </w:p>
+    <w:p>
+      <w:pPr/>
+      <w:r>
+        <w:rPr>
+          <w:b/>
+        </w:rPr>
+        <w:t xml:space="preserve">Solution. </w:t>
+      </w:r>
+      <w:r>
+        <w:rPr>
+          <w:i w:val="0"/>
+        </w:rPr>
+        <w:t>cos φ = 10^(−back-off/20). For 3 dB, cos φ = 0.708 and φ = 44.9°. For 6 dB, cos φ = 0.501, φ = 59.9°, essentially 60°. For 10 dB, cos φ = 0.316 and φ = 71.6°. The phase modulators must therefore cover angles up to about 70° to 80° with precision, because small phase errors near large angles produce large amplitude errors.</w:t>
+      </w:r>
+    </w:p>
+    <w:p>
+      <w:pPr>
+        <w:pStyle w:val="Heading2"/>
+      </w:pPr>
+      <w:r>
+        <w:rPr>
+          <w:i w:val="0"/>
+        </w:rPr>
+        <w:t>17.5 Choosing an architecture</w:t>
+      </w:r>
+    </w:p>
+    <w:p>
+      <w:pPr/>
+      <w:r>
+        <w:rPr>
+          <w:i w:val="0"/>
+        </w:rPr>
+        <w:t>In 2026 the Doherty amplifier dominates base stations, where moderate bandwidth, robust linearity with predistortion, and no extra supply circuitry suit the job. Envelope tracking dominates handset power amplifiers, where the supply modulator can be integrated and the signals are narrower. Outphasing and polar transmitters appear in research and some niche products, and digital transmitters that combine switching amplifiers with digital control of amplitude and phase are a growing area. All of them rely on the digital predistortion of Chapter 4 to meet the emission masks of Book 7.</w:t>
+      </w:r>
+    </w:p>
+    <w:p>
+      <w:pPr>
+        <w:pStyle w:val="Heading2"/>
+      </w:pPr>
+      <w:r>
+        <w:rPr>
+          <w:i w:val="0"/>
+        </w:rPr>
+        <w:t>Practice</w:t>
+      </w:r>
+    </w:p>
+    <w:p>
+      <w:pPr/>
+      <w:r>
+        <w:rPr>
+          <w:b/>
+        </w:rPr>
+        <w:t xml:space="preserve">1. </w:t>
+      </w:r>
+      <w:r>
+        <w:rPr>
+          <w:i w:val="0"/>
+        </w:rPr>
+        <w:t>Find the ideal class B efficiency at 10 dB back-off.</w:t>
+      </w:r>
+    </w:p>
+    <w:p>
+      <w:pPr/>
+      <w:r>
+        <w:rPr>
+          <w:b/>
+        </w:rPr>
+        <w:t xml:space="preserve">2. </w:t>
+      </w:r>
+      <w:r>
+        <w:rPr>
+          <w:i w:val="0"/>
+        </w:rPr>
+        <w:t>An ET system has a 70% amplifier and an 80% modulator. Find the total efficiency.</w:t>
+      </w:r>
+    </w:p>
+    <w:p>
+      <w:pPr/>
+      <w:r>
+        <w:rPr>
+          <w:b/>
+        </w:rPr>
+        <w:t xml:space="preserve">3. </w:t>
+      </w:r>
+      <w:r>
+        <w:rPr>
+          <w:i w:val="0"/>
+        </w:rPr>
+        <w:t>Find the outphasing angle for half power.</w:t>
+      </w:r>
+    </w:p>
+    <w:p>
+      <w:pPr/>
+      <w:r>
+        <w:rPr>
+          <w:b/>
+        </w:rPr>
+        <w:t xml:space="preserve">4. </w:t>
+      </w:r>
+      <w:r>
+        <w:rPr>
+          <w:i w:val="0"/>
+        </w:rPr>
+        <w:t>A 20 MHz LTE carrier is envelope-tracked. Estimate the tracker bandwidth.</w:t>
+      </w:r>
+    </w:p>
+    <w:p>
+      <w:pPr/>
+      <w:r>
+        <w:rPr>
+          <w:b/>
+        </w:rPr>
+        <w:t xml:space="preserve">5. </w:t>
+      </w:r>
+      <w:r>
+        <w:rPr>
+          <w:i w:val="0"/>
+        </w:rPr>
+        <w:t>Why does a polar transmitter struggle with wideband signals?</w:t>
+      </w:r>
+    </w:p>
+    <w:p>
+      <w:pPr/>
+      <w:r>
+        <w:rPr>
+          <w:b/>
+        </w:rPr>
+        <w:t xml:space="preserve">6. </w:t>
+      </w:r>
+      <w:r>
+        <w:rPr>
+          <w:i w:val="0"/>
+        </w:rPr>
+        <w:t>Why does a simple isolating combiner make outphasing inefficient?</w:t>
+      </w:r>
+    </w:p>
+    <w:p>
+      <w:pPr>
+        <w:pStyle w:val="Heading1"/>
+      </w:pPr>
+      <w:r>
+        <w:rPr>
+          <w:i w:val="0"/>
+        </w:rPr>
         <w:t>Appendix A. Constants and Formulas Used in This Book</w:t>
       </w:r>
     </w:p>
@@ -3006,6 +6211,51 @@
       </w:r>
     </w:p>
     <w:p>
+      <w:pPr/>
+      <w:r>
+        <w:rPr>
+          <w:i w:val="0"/>
+        </w:rPr>
+        <w:t>LNA: F = Fmin + (4Rn/Z0)|Γs − Γopt|²/[(1 − |Γs|²)|1 + Γopt|²]. Mixer image = fRF ∓ 2fIF; spurs at |m fLO ± n fRF| = fIF.</w:t>
+      </w:r>
+    </w:p>
+    <w:p>
+      <w:pPr/>
+      <w:r>
+        <w:rPr>
+          <w:i w:val="0"/>
+        </w:rPr>
+        <w:t>Link: Lpath = 20 log₁₀(4πdf/c); C/N0 = EIRP − Lpath + G/T + 228.6 dBHz. 12 GHz, 38,000 km: 205.6 dB.</w:t>
+      </w:r>
+    </w:p>
+    <w:p>
+      <w:pPr/>
+      <w:r>
+        <w:rPr>
+          <w:i w:val="0"/>
+        </w:rPr>
+        <w:t>|Γ| = (VSWR − 1)/(VSWR + 1); 10:1 gives 0.818, 66.9% reflected. Beam P = VI; perveance K = I/V^1.5.</w:t>
+      </w:r>
+    </w:p>
+    <w:p>
+      <w:pPr/>
+      <w:r>
+        <w:rPr>
+          <w:i w:val="0"/>
+        </w:rPr>
+        <w:t>Exposure: S = EIRP/(4πR²); FCC public 10 W/m² (1.5–100 GHz), f/1500 mW/cm² (300–1500 MHz); ground factor 2.56.</w:t>
+      </w:r>
+    </w:p>
+    <w:p>
+      <w:pPr/>
+      <w:r>
+        <w:rPr>
+          <w:i w:val="0"/>
+        </w:rPr>
+        <w:t>Class E (50% duty): R = 0.5768 VDD²/P, C = 0.1836/(ωR), vpk = 3.562 VDD. Outphasing: Pout = Pmax cos²φ.</w:t>
+      </w:r>
+    </w:p>
+    <w:p>
       <w:pPr>
         <w:pStyle w:val="Heading1"/>
       </w:pPr>
@@ -3826,6 +7076,915 @@
     </w:p>
     <w:p>
       <w:pPr>
+        <w:pStyle w:val="Heading2"/>
+      </w:pPr>
+      <w:r>
+        <w:rPr>
+          <w:i w:val="0"/>
+        </w:rPr>
+        <w:t>Chapter 9</w:t>
+      </w:r>
+    </w:p>
+    <w:p>
+      <w:pPr/>
+      <w:r>
+        <w:rPr>
+          <w:b/>
+        </w:rPr>
+        <w:t xml:space="preserve">1. </w:t>
+      </w:r>
+      <w:r>
+        <w:rPr>
+          <w:i w:val="0"/>
+        </w:rPr>
+        <w:t>F = 1.259 + 0.8 × 0.16/|1 + j0.4|² = 1.259 + 0.128/1.16 = 1.369, or 1.36 dB.</w:t>
+      </w:r>
+    </w:p>
+    <w:p>
+      <w:pPr/>
+      <w:r>
+        <w:rPr>
+          <w:b/>
+        </w:rPr>
+        <w:t xml:space="preserve">2. </w:t>
+      </w:r>
+      <w:r>
+        <w:rPr>
+          <w:i w:val="0"/>
+        </w:rPr>
+        <w:t>F = 1.122 × (1.259 + (10 − 1)/100) = 1.122 × 1.349 = 1.514, or 1.80 dB.</w:t>
+      </w:r>
+    </w:p>
+    <w:p>
+      <w:pPr/>
+      <w:r>
+        <w:rPr>
+          <w:b/>
+        </w:rPr>
+        <w:t xml:space="preserve">3. </w:t>
+      </w:r>
+      <w:r>
+        <w:rPr>
+          <w:i w:val="0"/>
+        </w:rPr>
+        <w:t>A real, noiseless resistive part, ωT Ls, which moves the input match toward the noise-optimum condition.</w:t>
+      </w:r>
+    </w:p>
+    <w:p>
+      <w:pPr/>
+      <w:r>
+        <w:rPr>
+          <w:b/>
+        </w:rPr>
+        <w:t xml:space="preserve">4. </w:t>
+      </w:r>
+      <w:r>
+        <w:rPr>
+          <w:i w:val="0"/>
+        </w:rPr>
+        <w:t>(15.85 − 1)/31.6 = 0.47.</w:t>
+      </w:r>
+    </w:p>
+    <w:p>
+      <w:pPr/>
+      <w:r>
+        <w:rPr>
+          <w:b/>
+        </w:rPr>
+        <w:t xml:space="preserve">5. </w:t>
+      </w:r>
+      <w:r>
+        <w:rPr>
+          <w:i w:val="0"/>
+        </w:rPr>
+        <w:t>If it has less gain, the following stages' noise is divided by a smaller number and may raise the system noise figure by more than the device's own improvement.</w:t>
+      </w:r>
+    </w:p>
+    <w:p>
+      <w:pPr/>
+      <w:r>
+        <w:rPr>
+          <w:b/>
+        </w:rPr>
+        <w:t xml:space="preserve">6. </w:t>
+      </w:r>
+      <w:r>
+        <w:rPr>
+          <w:i w:val="0"/>
+        </w:rPr>
+        <w:t>The reflections of the two identical halves reach the input through 90° hybrids with a 180° relative phase and cancel, being dissipated in the hybrid's isolated load.</w:t>
+      </w:r>
+    </w:p>
+    <w:p>
+      <w:pPr>
+        <w:pStyle w:val="Heading2"/>
+      </w:pPr>
+      <w:r>
+        <w:rPr>
+          <w:i w:val="0"/>
+        </w:rPr>
+        <w:t>Chapter 10</w:t>
+      </w:r>
+    </w:p>
+    <w:p>
+      <w:pPr/>
+      <w:r>
+        <w:rPr>
+          <w:b/>
+        </w:rPr>
+        <w:t xml:space="preserve">1. </w:t>
+      </w:r>
+      <w:r>
+        <w:rPr>
+          <w:i w:val="0"/>
+        </w:rPr>
+        <w:t>fLO = 6.8 GHz; the image is at 7.8 GHz.</w:t>
+      </w:r>
+    </w:p>
+    <w:p>
+      <w:pPr/>
+      <w:r>
+        <w:rPr>
+          <w:b/>
+        </w:rPr>
+        <w:t xml:space="preserve">2. </w:t>
+      </w:r>
+      <w:r>
+        <w:rPr>
+          <w:i w:val="0"/>
+        </w:rPr>
+        <w:t>fLO = 830 MHz; the half-IF spur is at fRF − fIF/2 = 865 MHz.</w:t>
+      </w:r>
+    </w:p>
+    <w:p>
+      <w:pPr/>
+      <w:r>
+        <w:rPr>
+          <w:b/>
+        </w:rPr>
+        <w:t xml:space="preserve">3. </w:t>
+      </w:r>
+      <w:r>
+        <w:rPr>
+          <w:i w:val="0"/>
+        </w:rPr>
+        <w:t>45 dB.</w:t>
+      </w:r>
+    </w:p>
+    <w:p>
+      <w:pPr/>
+      <w:r>
+        <w:rPr>
+          <w:b/>
+        </w:rPr>
+        <w:t xml:space="preserve">4. </w:t>
+      </w:r>
+      <w:r>
+        <w:rPr>
+          <w:i w:val="0"/>
+        </w:rPr>
+        <w:t>About 6.5 dB.</w:t>
+      </w:r>
+    </w:p>
+    <w:p>
+      <w:pPr/>
+      <w:r>
+        <w:rPr>
+          <w:b/>
+        </w:rPr>
+        <w:t xml:space="preserve">5. </w:t>
+      </w:r>
+      <w:r>
+        <w:rPr>
+          <w:i w:val="0"/>
+        </w:rPr>
+        <w:t>The image lies 2fIF from the wanted signal, so a higher IF moves it farther away, where a filter can attenuate it more easily.</w:t>
+      </w:r>
+    </w:p>
+    <w:p>
+      <w:pPr/>
+      <w:r>
+        <w:rPr>
+          <w:b/>
+        </w:rPr>
+        <w:t xml:space="preserve">6. </w:t>
+      </w:r>
+      <w:r>
+        <w:rPr>
+          <w:i w:val="0"/>
+        </w:rPr>
+        <w:t>The oscillator is at the carrier frequency, so any leakage appears in the middle of the transmitted channel, where it raises the EVM and cannot be filtered out.</w:t>
+      </w:r>
+    </w:p>
+    <w:p>
+      <w:pPr>
+        <w:pStyle w:val="Heading2"/>
+      </w:pPr>
+      <w:r>
+        <w:rPr>
+          <w:i w:val="0"/>
+        </w:rPr>
+        <w:t>Chapter 11</w:t>
+      </w:r>
+    </w:p>
+    <w:p>
+      <w:pPr/>
+      <w:r>
+        <w:rPr>
+          <w:b/>
+        </w:rPr>
+        <w:t xml:space="preserve">1. </w:t>
+      </w:r>
+      <w:r>
+        <w:rPr>
+          <w:i w:val="0"/>
+        </w:rPr>
+        <w:t>126.1 dB.</w:t>
+      </w:r>
+    </w:p>
+    <w:p>
+      <w:pPr/>
+      <w:r>
+        <w:rPr>
+          <w:b/>
+        </w:rPr>
+        <w:t xml:space="preserve">2. </w:t>
+      </w:r>
+      <w:r>
+        <w:rPr>
+          <w:i w:val="0"/>
+        </w:rPr>
+        <w:t>20 + 30 − 120 + 30 = −40 dBm.</w:t>
+      </w:r>
+    </w:p>
+    <w:p>
+      <w:pPr/>
+      <w:r>
+        <w:rPr>
+          <w:b/>
+        </w:rPr>
+        <w:t xml:space="preserve">3. </w:t>
+      </w:r>
+      <w:r>
+        <w:rPr>
+          <w:i w:val="0"/>
+        </w:rPr>
+        <w:t>Path loss 209.6 dB; C/N0 = 50 − 209.6 + 10 + 228.6 = 79.0 dBHz; C/N = 79.0 − 70.0 = 9.0 dB.</w:t>
+      </w:r>
+    </w:p>
+    <w:p>
+      <w:pPr/>
+      <w:r>
+        <w:rPr>
+          <w:b/>
+        </w:rPr>
+        <w:t xml:space="preserve">4. </w:t>
+      </w:r>
+      <w:r>
+        <w:rPr>
+          <w:i w:val="0"/>
+        </w:rPr>
+        <w:t>290(10^0.15 − 1) = 119.6 K.</w:t>
+      </w:r>
+    </w:p>
+    <w:p>
+      <w:pPr/>
+      <w:r>
+        <w:rPr>
+          <w:b/>
+        </w:rPr>
+        <w:t xml:space="preserve">5. </w:t>
+      </w:r>
+      <w:r>
+        <w:rPr>
+          <w:i w:val="0"/>
+        </w:rPr>
+        <w:t>20 log10 3 = 9.5 dB.</w:t>
+      </w:r>
+    </w:p>
+    <w:p>
+      <w:pPr/>
+      <w:r>
+        <w:rPr>
+          <w:b/>
+        </w:rPr>
+        <w:t xml:space="preserve">6. </w:t>
+      </w:r>
+      <w:r>
+        <w:rPr>
+          <w:i w:val="0"/>
+        </w:rPr>
+        <w:t>Received C/N0 depends on antenna gain and system noise temperature only through their ratio, so G/T captures the receiving station's whole contribution in one number.</w:t>
+      </w:r>
+    </w:p>
+    <w:p>
+      <w:pPr>
+        <w:pStyle w:val="Heading2"/>
+      </w:pPr>
+      <w:r>
+        <w:rPr>
+          <w:i w:val="0"/>
+        </w:rPr>
+        <w:t>Chapter 12</w:t>
+      </w:r>
+    </w:p>
+    <w:p>
+      <w:pPr/>
+      <w:r>
+        <w:rPr>
+          <w:b/>
+        </w:rPr>
+        <w:t xml:space="preserve">1. </w:t>
+      </w:r>
+      <w:r>
+        <w:rPr>
+          <w:i w:val="0"/>
+        </w:rPr>
+        <w:t>|Γ| = 0.333, return loss 9.5 dB, 11.1% reflected.</w:t>
+      </w:r>
+    </w:p>
+    <w:p>
+      <w:pPr/>
+      <w:r>
+        <w:rPr>
+          <w:b/>
+        </w:rPr>
+        <w:t xml:space="preserve">2. </w:t>
+      </w:r>
+      <w:r>
+        <w:rPr>
+          <w:i w:val="0"/>
+        </w:rPr>
+        <w:t>70.7 V matched; |Γ| = 0.667, so the worst case is 117.9 V.</w:t>
+      </w:r>
+    </w:p>
+    <w:p>
+      <w:pPr/>
+      <w:r>
+        <w:rPr>
+          <w:b/>
+        </w:rPr>
+        <w:t xml:space="preserve">3. </w:t>
+      </w:r>
+      <w:r>
+        <w:rPr>
+          <w:i w:val="0"/>
+        </w:rPr>
+        <w:t>75% of the power, or −1.25 dB.</w:t>
+      </w:r>
+    </w:p>
+    <w:p>
+      <w:pPr/>
+      <w:r>
+        <w:rPr>
+          <w:b/>
+        </w:rPr>
+        <w:t xml:space="preserve">4. </w:t>
+      </w:r>
+      <w:r>
+        <w:rPr>
+          <w:i w:val="0"/>
+        </w:rPr>
+        <w:t>With zero gate voltage the device is fully on, so powering the drain first would draw an uncontrolled current that can destroy it.</w:t>
+      </w:r>
+    </w:p>
+    <w:p>
+      <w:pPr/>
+      <w:r>
+        <w:rPr>
+          <w:b/>
+        </w:rPr>
+        <w:t xml:space="preserve">5. </w:t>
+      </w:r>
+      <w:r>
+        <w:rPr>
+          <w:i w:val="0"/>
+        </w:rPr>
+        <w:t>The smallest reflection it can measure, because forward power leaking into the reverse port masks a weak reflection.</w:t>
+      </w:r>
+    </w:p>
+    <w:p>
+      <w:pPr/>
+      <w:r>
+        <w:rPr>
+          <w:b/>
+        </w:rPr>
+        <w:t xml:space="preserve">6. </w:t>
+      </w:r>
+      <w:r>
+        <w:rPr>
+          <w:i w:val="0"/>
+        </w:rPr>
+        <w:t>The ballast resistor provides negative feedback against the falling base-emitter voltage as the device heats, preventing thermal runaway and current hogging between cells.</w:t>
+      </w:r>
+    </w:p>
+    <w:p>
+      <w:pPr>
+        <w:pStyle w:val="Heading2"/>
+      </w:pPr>
+      <w:r>
+        <w:rPr>
+          <w:i w:val="0"/>
+        </w:rPr>
+        <w:t>Chapter 13</w:t>
+      </w:r>
+    </w:p>
+    <w:p>
+      <w:pPr/>
+      <w:r>
+        <w:rPr>
+          <w:b/>
+        </w:rPr>
+        <w:t xml:space="preserve">1. </w:t>
+      </w:r>
+      <w:r>
+        <w:rPr>
+          <w:i w:val="0"/>
+        </w:rPr>
+        <w:t>40 kW; perveance 2/(2 × 10⁴)^1.5 = 0.71 µperv.</w:t>
+      </w:r>
+    </w:p>
+    <w:p>
+      <w:pPr/>
+      <w:r>
+        <w:rPr>
+          <w:b/>
+        </w:rPr>
+        <w:t xml:space="preserve">2. </w:t>
+      </w:r>
+      <w:r>
+        <w:rPr>
+          <w:i w:val="0"/>
+        </w:rPr>
+        <w:t>γ = 1.039, so v = 0.272c.</w:t>
+      </w:r>
+    </w:p>
+    <w:p>
+      <w:pPr/>
+      <w:r>
+        <w:rPr>
+          <w:b/>
+        </w:rPr>
+        <w:t xml:space="preserve">3. </w:t>
+      </w:r>
+      <w:r>
+        <w:rPr>
+          <w:i w:val="0"/>
+        </w:rPr>
+        <w:t>1429 W in; 429 W of heat.</w:t>
+      </w:r>
+    </w:p>
+    <w:p>
+      <w:pPr/>
+      <w:r>
+        <w:rPr>
+          <w:b/>
+        </w:rPr>
+        <w:t xml:space="preserve">4. </w:t>
+      </w:r>
+      <w:r>
+        <w:rPr>
+          <w:i w:val="0"/>
+        </w:rPr>
+        <w:t>The klystron interacts through resonant cavities, which have narrow bandwidths; the helix is a nonresonant slow-wave structure whose phase velocity is nearly constant over a wide band.</w:t>
+      </w:r>
+    </w:p>
+    <w:p>
+      <w:pPr/>
+      <w:r>
+        <w:rPr>
+          <w:b/>
+        </w:rPr>
+        <w:t xml:space="preserve">5. </w:t>
+      </w:r>
+      <w:r>
+        <w:rPr>
+          <w:i w:val="0"/>
+        </w:rPr>
+        <w:t>It decelerates the spent electrons with a retarding voltage before they land, returning part of their energy to the supply and raising efficiency.</w:t>
+      </w:r>
+    </w:p>
+    <w:p>
+      <w:pPr/>
+      <w:r>
+        <w:rPr>
+          <w:b/>
+        </w:rPr>
+        <w:t xml:space="preserve">6. </w:t>
+      </w:r>
+      <w:r>
+        <w:rPr>
+          <w:i w:val="0"/>
+        </w:rPr>
+        <w:t>2400 × 10^(−0.05) = 2.14 kW.</w:t>
+      </w:r>
+    </w:p>
+    <w:p>
+      <w:pPr>
+        <w:pStyle w:val="Heading2"/>
+      </w:pPr>
+      <w:r>
+        <w:rPr>
+          <w:i w:val="0"/>
+        </w:rPr>
+        <w:t>Chapter 14</w:t>
+      </w:r>
+    </w:p>
+    <w:p>
+      <w:pPr/>
+      <w:r>
+        <w:rPr>
+          <w:b/>
+        </w:rPr>
+        <w:t xml:space="preserve">1. </w:t>
+      </w:r>
+      <w:r>
+        <w:rPr>
+          <w:i w:val="0"/>
+        </w:rPr>
+        <w:t>10 W/m².</w:t>
+      </w:r>
+    </w:p>
+    <w:p>
+      <w:pPr/>
+      <w:r>
+        <w:rPr>
+          <w:b/>
+        </w:rPr>
+        <w:t xml:space="preserve">2. </w:t>
+      </w:r>
+      <w:r>
+        <w:rPr>
+          <w:i w:val="0"/>
+        </w:rPr>
+        <w:t>600/1500 = 0.4 mW/cm², or 4 W/m².</w:t>
+      </w:r>
+    </w:p>
+    <w:p>
+      <w:pPr/>
+      <w:r>
+        <w:rPr>
+          <w:b/>
+        </w:rPr>
+        <w:t xml:space="preserve">3. </w:t>
+      </w:r>
+      <w:r>
+        <w:rPr>
+          <w:i w:val="0"/>
+        </w:rPr>
+        <w:t>50 / (4π × 9) = 0.44 W/m².</w:t>
+      </w:r>
+    </w:p>
+    <w:p>
+      <w:pPr/>
+      <w:r>
+        <w:rPr>
+          <w:b/>
+        </w:rPr>
+        <w:t xml:space="preserve">4. </w:t>
+      </w:r>
+      <w:r>
+        <w:rPr>
+          <w:i w:val="0"/>
+        </w:rPr>
+        <w:t>√(1000 / (4π × 10)) = 2.82 m.</w:t>
+      </w:r>
+    </w:p>
+    <w:p>
+      <w:pPr/>
+      <w:r>
+        <w:rPr>
+          <w:b/>
+        </w:rPr>
+        <w:t xml:space="preserve">5. </w:t>
+      </w:r>
+      <w:r>
+        <w:rPr>
+          <w:i w:val="0"/>
+        </w:rPr>
+        <w:t>E = √(S × 377 Ω) = 61.4 V/m.</w:t>
+      </w:r>
+    </w:p>
+    <w:p>
+      <w:pPr/>
+      <w:r>
+        <w:rPr>
+          <w:b/>
+        </w:rPr>
+        <w:t xml:space="preserve">6. </w:t>
+      </w:r>
+      <w:r>
+        <w:rPr>
+          <w:i w:val="0"/>
+        </w:rPr>
+        <w:t>The head is in the antenna's reactive near field, where power density is not well defined and the energy couples directly into tissue, so the absorbed power per mass is what matters.</w:t>
+      </w:r>
+    </w:p>
+    <w:p>
+      <w:pPr>
+        <w:pStyle w:val="Heading2"/>
+      </w:pPr>
+      <w:r>
+        <w:rPr>
+          <w:i w:val="0"/>
+        </w:rPr>
+        <w:t>Chapter 15</w:t>
+      </w:r>
+    </w:p>
+    <w:p>
+      <w:pPr/>
+      <w:r>
+        <w:rPr>
+          <w:b/>
+        </w:rPr>
+        <w:t xml:space="preserve">1. </w:t>
+      </w:r>
+      <w:r>
+        <w:rPr>
+          <w:i w:val="0"/>
+        </w:rPr>
+        <w:t>−170 dBm/Hz.</w:t>
+      </w:r>
+    </w:p>
+    <w:p>
+      <w:pPr/>
+      <w:r>
+        <w:rPr>
+          <w:b/>
+        </w:rPr>
+        <w:t xml:space="preserve">2. </w:t>
+      </w:r>
+      <w:r>
+        <w:rPr>
+          <w:i w:val="0"/>
+        </w:rPr>
+        <w:t>10 log10(1 + 10^(−0.6)) = 0.97 dB.</w:t>
+      </w:r>
+    </w:p>
+    <w:p>
+      <w:pPr/>
+      <w:r>
+        <w:rPr>
+          <w:b/>
+        </w:rPr>
+        <w:t xml:space="preserve">3. </w:t>
+      </w:r>
+      <w:r>
+        <w:rPr>
+          <w:i w:val="0"/>
+        </w:rPr>
+        <w:t>Noise floor −174 + 70 + 4 = −100 dBm, so 123 dB.</w:t>
+      </w:r>
+    </w:p>
+    <w:p>
+      <w:pPr/>
+      <w:r>
+        <w:rPr>
+          <w:b/>
+        </w:rPr>
+        <w:t xml:space="preserve">4. </w:t>
+      </w:r>
+      <w:r>
+        <w:rPr>
+          <w:i w:val="0"/>
+        </w:rPr>
+        <w:t>−27 dBm.</w:t>
+      </w:r>
+    </w:p>
+    <w:p>
+      <w:pPr/>
+      <w:r>
+        <w:rPr>
+          <w:b/>
+        </w:rPr>
+        <w:t xml:space="preserve">5. </w:t>
+      </w:r>
+      <w:r>
+        <w:rPr>
+          <w:i w:val="0"/>
+        </w:rPr>
+        <w:t>The receiver is not listening while the transmitter is on, so only the switch's isolation and settling matter, not continuous isolation during transmission.</w:t>
+      </w:r>
+    </w:p>
+    <w:p>
+      <w:pPr/>
+      <w:r>
+        <w:rPr>
+          <w:b/>
+        </w:rPr>
+        <w:t xml:space="preserve">6. </w:t>
+      </w:r>
+      <w:r>
+        <w:rPr>
+          <w:i w:val="0"/>
+        </w:rPr>
+        <w:t>The noise lies at the same frequencies as the wanted signal, so any filter that removed it would also remove the signal; it has to be stopped before it reaches the receiver.</w:t>
+      </w:r>
+    </w:p>
+    <w:p>
+      <w:pPr>
+        <w:pStyle w:val="Heading2"/>
+      </w:pPr>
+      <w:r>
+        <w:rPr>
+          <w:i w:val="0"/>
+        </w:rPr>
+        <w:t>Chapter 16</w:t>
+      </w:r>
+    </w:p>
+    <w:p>
+      <w:pPr/>
+      <w:r>
+        <w:rPr>
+          <w:b/>
+        </w:rPr>
+        <w:t xml:space="preserve">1. </w:t>
+      </w:r>
+      <w:r>
+        <w:rPr>
+          <w:i w:val="0"/>
+        </w:rPr>
+        <w:t>R = 0.5768 × 144/10 = 8.31 Ω; C = 0.1836/(2π × 13.56 × 10⁶ × 8.31) = 259 pF.</w:t>
+      </w:r>
+    </w:p>
+    <w:p>
+      <w:pPr/>
+      <w:r>
+        <w:rPr>
+          <w:b/>
+        </w:rPr>
+        <w:t xml:space="preserve">2. </w:t>
+      </w:r>
+      <w:r>
+        <w:rPr>
+          <w:i w:val="0"/>
+        </w:rPr>
+        <w:t>3.562 × 12 = 42.7 V.</w:t>
+      </w:r>
+    </w:p>
+    <w:p>
+      <w:pPr/>
+      <w:r>
+        <w:rPr>
+          <w:b/>
+        </w:rPr>
+        <w:t xml:space="preserve">3. </w:t>
+      </w:r>
+      <w:r>
+        <w:rPr>
+          <w:i w:val="0"/>
+        </w:rPr>
+        <w:t>1292 MHz.</w:t>
+      </w:r>
+    </w:p>
+    <w:p>
+      <w:pPr/>
+      <w:r>
+        <w:rPr>
+          <w:b/>
+        </w:rPr>
+        <w:t xml:space="preserve">4. </w:t>
+      </w:r>
+      <w:r>
+        <w:rPr>
+          <w:i w:val="0"/>
+        </w:rPr>
+        <w:t>78.5%, the class B value.</w:t>
+      </w:r>
+    </w:p>
+    <w:p>
+      <w:pPr/>
+      <w:r>
+        <w:rPr>
+          <w:b/>
+        </w:rPr>
+        <w:t xml:space="preserve">5. </w:t>
+      </w:r>
+      <w:r>
+        <w:rPr>
+          <w:i w:val="0"/>
+        </w:rPr>
+        <w:t>Its peak voltage is about 3.6 times the supply, and GaN's high breakdown voltage tolerates that swing at a useful supply voltage.</w:t>
+      </w:r>
+    </w:p>
+    <w:p>
+      <w:pPr/>
+      <w:r>
+        <w:rPr>
+          <w:b/>
+        </w:rPr>
+        <w:t xml:space="preserve">6. </w:t>
+      </w:r>
+      <w:r>
+        <w:rPr>
+          <w:i w:val="0"/>
+        </w:rPr>
+        <w:t>Each additional harmonic adds less to the fundamental amplitude, so the first two or three do most of the waveform shaping; the device capacitance also suppresses the higher harmonics.</w:t>
+      </w:r>
+    </w:p>
+    <w:p>
+      <w:pPr>
+        <w:pStyle w:val="Heading2"/>
+      </w:pPr>
+      <w:r>
+        <w:rPr>
+          <w:i w:val="0"/>
+        </w:rPr>
+        <w:t>Chapter 17</w:t>
+      </w:r>
+    </w:p>
+    <w:p>
+      <w:pPr/>
+      <w:r>
+        <w:rPr>
+          <w:b/>
+        </w:rPr>
+        <w:t xml:space="preserve">1. </w:t>
+      </w:r>
+      <w:r>
+        <w:rPr>
+          <w:i w:val="0"/>
+        </w:rPr>
+        <w:t>78.5% × 10^(−0.5) = 24.8%.</w:t>
+      </w:r>
+    </w:p>
+    <w:p>
+      <w:pPr/>
+      <w:r>
+        <w:rPr>
+          <w:b/>
+        </w:rPr>
+        <w:t xml:space="preserve">2. </w:t>
+      </w:r>
+      <w:r>
+        <w:rPr>
+          <w:i w:val="0"/>
+        </w:rPr>
+        <w:t>56%.</w:t>
+      </w:r>
+    </w:p>
+    <w:p>
+      <w:pPr/>
+      <w:r>
+        <w:rPr>
+          <w:b/>
+        </w:rPr>
+        <w:t xml:space="preserve">3. </w:t>
+      </w:r>
+      <w:r>
+        <w:rPr>
+          <w:i w:val="0"/>
+        </w:rPr>
+        <w:t>cos²φ = 0.5, so φ = 45°.</w:t>
+      </w:r>
+    </w:p>
+    <w:p>
+      <w:pPr/>
+      <w:r>
+        <w:rPr>
+          <w:b/>
+        </w:rPr>
+        <w:t xml:space="preserve">4. </w:t>
+      </w:r>
+      <w:r>
+        <w:rPr>
+          <w:i w:val="0"/>
+        </w:rPr>
+        <w:t>About 60 to 100 MHz.</w:t>
+      </w:r>
+    </w:p>
+    <w:p>
+      <w:pPr/>
+      <w:r>
+        <w:rPr>
+          <w:b/>
+        </w:rPr>
+        <w:t xml:space="preserve">5. </w:t>
+      </w:r>
+      <w:r>
+        <w:rPr>
+          <w:i w:val="0"/>
+        </w:rPr>
+        <w:t>The envelope's bandwidth is several times the signal's, and the amplitude and phase paths must be aligned precisely; efficient supply modulators cannot follow a wide envelope.</w:t>
+      </w:r>
+    </w:p>
+    <w:p>
+      <w:pPr/>
+      <w:r>
+        <w:rPr>
+          <w:b/>
+        </w:rPr>
+        <w:t xml:space="preserve">6. </w:t>
+      </w:r>
+      <w:r>
+        <w:rPr>
+          <w:i w:val="0"/>
+        </w:rPr>
+        <w:t>At back-off, the two amplifiers' outputs partially cancel, and an isolating combiner dissipates the cancelled power in its isolation resistor instead of returning it.</w:t>
+      </w:r>
+    </w:p>
+    <w:p>
+      <w:pPr>
         <w:pStyle w:val="Heading1"/>
       </w:pPr>
       <w:r>
@@ -3896,6 +8055,60 @@
           <w:i w:val="0"/>
         </w:rPr>
         <w:t>W. H. Doherty, "A New High Efficiency Power Amplifier for Modulated Waves," Proceedings of the IRE, 1936.</w:t>
+      </w:r>
+    </w:p>
+    <w:p>
+      <w:pPr/>
+      <w:r>
+        <w:rPr>
+          <w:i w:val="0"/>
+        </w:rPr>
+        <w:t>Les Besser and Rowan Gilmore, Practical RF Circuit Design for Modern Wireless Systems, and Guillermo Gonzalez, Microwave Transistor Amplifiers, 2nd edition, for the LNA and mixers (Chapters 9 and 10).</w:t>
+      </w:r>
+    </w:p>
+    <w:p>
+      <w:pPr/>
+      <w:r>
+        <w:rPr>
+          <w:i w:val="0"/>
+        </w:rPr>
+        <w:t>David M. Pozar, Microwave Engineering, 4th edition, for the link equation (Chapter 11).</w:t>
+      </w:r>
+    </w:p>
+    <w:p>
+      <w:pPr/>
+      <w:r>
+        <w:rPr>
+          <w:i w:val="0"/>
+        </w:rPr>
+        <w:t>Jerry C. Whitaker, Power Vacuum Tubes Handbook, and A. S. Gilmour, Klystrons, Traveling Wave Tubes, Magnetrons, Crossed-Field Amplifiers, and Gyrotrons, for Chapter 13.</w:t>
+      </w:r>
+    </w:p>
+    <w:p>
+      <w:pPr/>
+      <w:r>
+        <w:rPr>
+          <w:i w:val="0"/>
+        </w:rPr>
+        <w:t>IEEE C95.1-2019; ICNIRP Guidelines for Limiting Exposure to Electromagnetic Fields (100 kHz to 300 GHz), 2020; 47 CFR 1.1310; and FCC OET Bulletin 65, for Chapter 14.</w:t>
+      </w:r>
+    </w:p>
+    <w:p>
+      <w:pPr/>
+      <w:r>
+        <w:rPr>
+          <w:i w:val="0"/>
+        </w:rPr>
+        <w:t>N. O. Sokal and A. D. Sokal, "Class E: A New Class of High-Efficiency Tuned Single-Ended Switching Power Amplifiers," IEEE JSSC, 1975; Marian K. Kazimierczuk, RF Power Amplifiers, 2nd edition; and F. H. Raab, "Maximum Efficiency and Output of Class-F Power Amplifiers," IEEE MTT, 2001, for Chapter 16.</w:t>
+      </w:r>
+    </w:p>
+    <w:p>
+      <w:pPr/>
+      <w:r>
+        <w:rPr>
+          <w:i w:val="0"/>
+        </w:rPr>
+        <w:t>F. H. Raab et al., "Power Amplifiers and Transmitters for RF and Microwave," IEEE MTT, 2002, and H. Chireix, "High Power Outphasing Modulation," Proceedings of the IRE, 1935, for Chapter 17.</w:t>
       </w:r>
     </w:p>
     <w:sectPr>

</xml_diff>